<commit_message>
docs(i52): sign off verified MCP workflows and archive screenshot evidence
</commit_message>
<xml_diff>
--- a/docs/acceptance/evidence/DEMO/demo.docx
+++ b/docs/acceptance/evidence/DEMO/demo.docx
@@ -4,7 +4,7 @@
   <w:body>
     <w:p>
       <w:r>
-        <w:object w:dxaOrig="14416" w:dyaOrig="8161" w14:anchorId="31F68C43">
+        <w:object w:dxaOrig="14416" w:dyaOrig="8161" w14:anchorId="58952338">
           <v:shapetype id="_x0000_t75" coordsize="21600,21600" o:spt="75" o:preferrelative="t" path="m@4@5l@4@11@9@11@9@5xe" filled="f" stroked="f">
             <v:stroke joinstyle="miter"/>
             <v:formulas>
@@ -24,10 +24,10 @@
             <v:path o:extrusionok="f" gradientshapeok="t" o:connecttype="rect"/>
             <o:lock v:ext="edit" aspectratio="t"/>
           </v:shapetype>
-          <v:shape id="_x0000_i1028" type="#_x0000_t75" style="width:720.95pt;height:408.15pt" o:ole="">
+          <v:shape id="_x0000_i1028" type="#_x0000_t75" style="width:720.75pt;height:408pt" o:ole="">
             <v:imagedata r:id="rId4" o:title=""/>
           </v:shape>
-          <o:OLEObject Type="Embed" ProgID="Visio.Drawing.15" ShapeID="_x0000_i1028" DrawAspect="Content" ObjectID="_1853829724" r:id="rId5"/>
+          <o:OLEObject Type="Embed" ProgID="Visio.Drawing.15" ShapeID="_x0000_i1028" DrawAspect="Content" ObjectID="_1853838173" r:id="rId5"/>
         </w:object>
       </w:r>
     </w:p>
@@ -449,7 +449,7 @@
     <w:link w:val="Heading1Char"/>
     <w:uiPriority w:val="9"/>
     <w:qFormat/>
-    <w:rsid w:val="00863B42"/>
+    <w:rsid w:val="00DC3E06"/>
     <w:pPr>
       <w:keepNext/>
       <w:keepLines/>
@@ -472,7 +472,7 @@
     <w:semiHidden/>
     <w:unhideWhenUsed/>
     <w:qFormat/>
-    <w:rsid w:val="00863B42"/>
+    <w:rsid w:val="00DC3E06"/>
     <w:pPr>
       <w:keepNext/>
       <w:keepLines/>
@@ -495,7 +495,7 @@
     <w:semiHidden/>
     <w:unhideWhenUsed/>
     <w:qFormat/>
-    <w:rsid w:val="00863B42"/>
+    <w:rsid w:val="00DC3E06"/>
     <w:pPr>
       <w:keepNext/>
       <w:keepLines/>
@@ -518,7 +518,7 @@
     <w:semiHidden/>
     <w:unhideWhenUsed/>
     <w:qFormat/>
-    <w:rsid w:val="00863B42"/>
+    <w:rsid w:val="00DC3E06"/>
     <w:pPr>
       <w:keepNext/>
       <w:keepLines/>
@@ -541,7 +541,7 @@
     <w:semiHidden/>
     <w:unhideWhenUsed/>
     <w:qFormat/>
-    <w:rsid w:val="00863B42"/>
+    <w:rsid w:val="00DC3E06"/>
     <w:pPr>
       <w:keepNext/>
       <w:keepLines/>
@@ -562,7 +562,7 @@
     <w:semiHidden/>
     <w:unhideWhenUsed/>
     <w:qFormat/>
-    <w:rsid w:val="00863B42"/>
+    <w:rsid w:val="00DC3E06"/>
     <w:pPr>
       <w:keepNext/>
       <w:keepLines/>
@@ -585,7 +585,7 @@
     <w:semiHidden/>
     <w:unhideWhenUsed/>
     <w:qFormat/>
-    <w:rsid w:val="00863B42"/>
+    <w:rsid w:val="00DC3E06"/>
     <w:pPr>
       <w:keepNext/>
       <w:keepLines/>
@@ -606,7 +606,7 @@
     <w:semiHidden/>
     <w:unhideWhenUsed/>
     <w:qFormat/>
-    <w:rsid w:val="00863B42"/>
+    <w:rsid w:val="00DC3E06"/>
     <w:pPr>
       <w:keepNext/>
       <w:keepLines/>
@@ -629,7 +629,7 @@
     <w:semiHidden/>
     <w:unhideWhenUsed/>
     <w:qFormat/>
-    <w:rsid w:val="00863B42"/>
+    <w:rsid w:val="00DC3E06"/>
     <w:pPr>
       <w:keepNext/>
       <w:keepLines/>
@@ -668,56 +668,12 @@
     <w:semiHidden/>
     <w:unhideWhenUsed/>
   </w:style>
-  <w:style w:type="table" w:customStyle="1" w:styleId="SensicalTable1">
-    <w:name w:val="Sensical Table 1"/>
-    <w:basedOn w:val="TableNormal"/>
-    <w:uiPriority w:val="99"/>
-    <w:rsid w:val="00287509"/>
-    <w:pPr>
-      <w:spacing w:before="60" w:after="60" w:line="240" w:lineRule="auto"/>
-      <w:jc w:val="both"/>
-    </w:pPr>
-    <w:rPr>
-      <w:kern w:val="0"/>
-      <w:sz w:val="22"/>
-      <w:szCs w:val="22"/>
-      <w14:ligatures w14:val="none"/>
-    </w:rPr>
-    <w:tblPr>
-      <w:tblStyleRowBandSize w:val="1"/>
-      <w:tblStyleColBandSize w:val="1"/>
-      <w:tblBorders>
-        <w:top w:val="single" w:sz="4" w:space="0" w:color="252666"/>
-        <w:left w:val="single" w:sz="4" w:space="0" w:color="252666"/>
-        <w:bottom w:val="single" w:sz="4" w:space="0" w:color="252666"/>
-        <w:right w:val="single" w:sz="4" w:space="0" w:color="252666"/>
-        <w:insideH w:val="single" w:sz="4" w:space="0" w:color="252666"/>
-        <w:insideV w:val="single" w:sz="4" w:space="0" w:color="252666"/>
-      </w:tblBorders>
-    </w:tblPr>
-    <w:tblStylePr w:type="firstRow">
-      <w:pPr>
-        <w:wordWrap/>
-        <w:spacing w:beforeLines="0" w:before="60" w:beforeAutospacing="0" w:afterLines="0" w:after="60" w:afterAutospacing="0"/>
-      </w:pPr>
-      <w:rPr>
-        <w:rFonts w:ascii="Calibri" w:hAnsi="Calibri"/>
-        <w:b/>
-        <w:color w:val="auto"/>
-        <w:sz w:val="22"/>
-      </w:rPr>
-      <w:tblPr/>
-      <w:tcPr>
-        <w:shd w:val="clear" w:color="auto" w:fill="C1E4F5" w:themeFill="accent1" w:themeFillTint="33"/>
-      </w:tcPr>
-    </w:tblStylePr>
-  </w:style>
   <w:style w:type="character" w:customStyle="1" w:styleId="Heading1Char">
     <w:name w:val="Heading 1 Char"/>
     <w:basedOn w:val="DefaultParagraphFont"/>
     <w:link w:val="Heading1"/>
     <w:uiPriority w:val="9"/>
-    <w:rsid w:val="00863B42"/>
+    <w:rsid w:val="00DC3E06"/>
     <w:rPr>
       <w:rFonts w:asciiTheme="majorHAnsi" w:eastAsiaTheme="majorEastAsia" w:hAnsiTheme="majorHAnsi" w:cstheme="majorBidi"/>
       <w:color w:val="0F4761" w:themeColor="accent1" w:themeShade="BF"/>
@@ -731,7 +687,7 @@
     <w:link w:val="Heading2"/>
     <w:uiPriority w:val="9"/>
     <w:semiHidden/>
-    <w:rsid w:val="00863B42"/>
+    <w:rsid w:val="00DC3E06"/>
     <w:rPr>
       <w:rFonts w:asciiTheme="majorHAnsi" w:eastAsiaTheme="majorEastAsia" w:hAnsiTheme="majorHAnsi" w:cstheme="majorBidi"/>
       <w:color w:val="0F4761" w:themeColor="accent1" w:themeShade="BF"/>
@@ -745,7 +701,7 @@
     <w:link w:val="Heading3"/>
     <w:uiPriority w:val="9"/>
     <w:semiHidden/>
-    <w:rsid w:val="00863B42"/>
+    <w:rsid w:val="00DC3E06"/>
     <w:rPr>
       <w:rFonts w:eastAsiaTheme="majorEastAsia" w:cstheme="majorBidi"/>
       <w:color w:val="0F4761" w:themeColor="accent1" w:themeShade="BF"/>
@@ -759,7 +715,7 @@
     <w:link w:val="Heading4"/>
     <w:uiPriority w:val="9"/>
     <w:semiHidden/>
-    <w:rsid w:val="00863B42"/>
+    <w:rsid w:val="00DC3E06"/>
     <w:rPr>
       <w:rFonts w:eastAsiaTheme="majorEastAsia" w:cstheme="majorBidi"/>
       <w:i/>
@@ -773,7 +729,7 @@
     <w:link w:val="Heading5"/>
     <w:uiPriority w:val="9"/>
     <w:semiHidden/>
-    <w:rsid w:val="00863B42"/>
+    <w:rsid w:val="00DC3E06"/>
     <w:rPr>
       <w:rFonts w:eastAsiaTheme="majorEastAsia" w:cstheme="majorBidi"/>
       <w:color w:val="0F4761" w:themeColor="accent1" w:themeShade="BF"/>
@@ -785,7 +741,7 @@
     <w:link w:val="Heading6"/>
     <w:uiPriority w:val="9"/>
     <w:semiHidden/>
-    <w:rsid w:val="00863B42"/>
+    <w:rsid w:val="00DC3E06"/>
     <w:rPr>
       <w:rFonts w:eastAsiaTheme="majorEastAsia" w:cstheme="majorBidi"/>
       <w:i/>
@@ -799,7 +755,7 @@
     <w:link w:val="Heading7"/>
     <w:uiPriority w:val="9"/>
     <w:semiHidden/>
-    <w:rsid w:val="00863B42"/>
+    <w:rsid w:val="00DC3E06"/>
     <w:rPr>
       <w:rFonts w:eastAsiaTheme="majorEastAsia" w:cstheme="majorBidi"/>
       <w:color w:val="595959" w:themeColor="text1" w:themeTint="A6"/>
@@ -811,7 +767,7 @@
     <w:link w:val="Heading8"/>
     <w:uiPriority w:val="9"/>
     <w:semiHidden/>
-    <w:rsid w:val="00863B42"/>
+    <w:rsid w:val="00DC3E06"/>
     <w:rPr>
       <w:rFonts w:eastAsiaTheme="majorEastAsia" w:cstheme="majorBidi"/>
       <w:i/>
@@ -825,7 +781,7 @@
     <w:link w:val="Heading9"/>
     <w:uiPriority w:val="9"/>
     <w:semiHidden/>
-    <w:rsid w:val="00863B42"/>
+    <w:rsid w:val="00DC3E06"/>
     <w:rPr>
       <w:rFonts w:eastAsiaTheme="majorEastAsia" w:cstheme="majorBidi"/>
       <w:color w:val="272727" w:themeColor="text1" w:themeTint="D8"/>
@@ -838,7 +794,7 @@
     <w:link w:val="TitleChar"/>
     <w:uiPriority w:val="10"/>
     <w:qFormat/>
-    <w:rsid w:val="00863B42"/>
+    <w:rsid w:val="00DC3E06"/>
     <w:pPr>
       <w:spacing w:after="80" w:line="240" w:lineRule="auto"/>
       <w:contextualSpacing/>
@@ -856,7 +812,7 @@
     <w:basedOn w:val="DefaultParagraphFont"/>
     <w:link w:val="Title"/>
     <w:uiPriority w:val="10"/>
-    <w:rsid w:val="00863B42"/>
+    <w:rsid w:val="00DC3E06"/>
     <w:rPr>
       <w:rFonts w:asciiTheme="majorHAnsi" w:eastAsiaTheme="majorEastAsia" w:hAnsiTheme="majorHAnsi" w:cstheme="majorBidi"/>
       <w:spacing w:val="-10"/>
@@ -872,7 +828,7 @@
     <w:link w:val="SubtitleChar"/>
     <w:uiPriority w:val="11"/>
     <w:qFormat/>
-    <w:rsid w:val="00863B42"/>
+    <w:rsid w:val="00DC3E06"/>
     <w:pPr>
       <w:numPr>
         <w:ilvl w:val="1"/>
@@ -891,7 +847,7 @@
     <w:basedOn w:val="DefaultParagraphFont"/>
     <w:link w:val="Subtitle"/>
     <w:uiPriority w:val="11"/>
-    <w:rsid w:val="00863B42"/>
+    <w:rsid w:val="00DC3E06"/>
     <w:rPr>
       <w:rFonts w:eastAsiaTheme="majorEastAsia" w:cstheme="majorBidi"/>
       <w:color w:val="595959" w:themeColor="text1" w:themeTint="A6"/>
@@ -907,7 +863,7 @@
     <w:link w:val="QuoteChar"/>
     <w:uiPriority w:val="29"/>
     <w:qFormat/>
-    <w:rsid w:val="00863B42"/>
+    <w:rsid w:val="00DC3E06"/>
     <w:pPr>
       <w:spacing w:before="160"/>
       <w:jc w:val="center"/>
@@ -923,7 +879,7 @@
     <w:basedOn w:val="DefaultParagraphFont"/>
     <w:link w:val="Quote"/>
     <w:uiPriority w:val="29"/>
-    <w:rsid w:val="00863B42"/>
+    <w:rsid w:val="00DC3E06"/>
     <w:rPr>
       <w:i/>
       <w:iCs/>
@@ -935,7 +891,7 @@
     <w:basedOn w:val="Normal"/>
     <w:uiPriority w:val="34"/>
     <w:qFormat/>
-    <w:rsid w:val="00863B42"/>
+    <w:rsid w:val="00DC3E06"/>
     <w:pPr>
       <w:ind w:left="720"/>
       <w:contextualSpacing/>
@@ -946,7 +902,7 @@
     <w:basedOn w:val="DefaultParagraphFont"/>
     <w:uiPriority w:val="21"/>
     <w:qFormat/>
-    <w:rsid w:val="00863B42"/>
+    <w:rsid w:val="00DC3E06"/>
     <w:rPr>
       <w:i/>
       <w:iCs/>
@@ -960,7 +916,7 @@
     <w:link w:val="IntenseQuoteChar"/>
     <w:uiPriority w:val="30"/>
     <w:qFormat/>
-    <w:rsid w:val="00863B42"/>
+    <w:rsid w:val="00DC3E06"/>
     <w:pPr>
       <w:pBdr>
         <w:top w:val="single" w:sz="4" w:space="10" w:color="0F4761" w:themeColor="accent1" w:themeShade="BF"/>
@@ -981,7 +937,7 @@
     <w:basedOn w:val="DefaultParagraphFont"/>
     <w:link w:val="IntenseQuote"/>
     <w:uiPriority w:val="30"/>
-    <w:rsid w:val="00863B42"/>
+    <w:rsid w:val="00DC3E06"/>
     <w:rPr>
       <w:i/>
       <w:iCs/>
@@ -993,7 +949,7 @@
     <w:basedOn w:val="DefaultParagraphFont"/>
     <w:uiPriority w:val="32"/>
     <w:qFormat/>
-    <w:rsid w:val="00863B42"/>
+    <w:rsid w:val="00DC3E06"/>
     <w:rPr>
       <w:b/>
       <w:bCs/>

</xml_diff>

<commit_message>
feat(w02a): workspace in the page and a document registry in the host (#40)
Host router and recovery follow every open document; the page holds a Workspace
of documents with requests routed by document id. One tab, no visible change.

Co-Authored-By: Claude Sonnet 5.5 <noreply@anthropic.com>
</commit_message>
<xml_diff>
--- a/docs/acceptance/evidence/DEMO/demo.docx
+++ b/docs/acceptance/evidence/DEMO/demo.docx
@@ -4,7 +4,7 @@
   <w:body>
     <w:p>
       <w:r>
-        <w:object w:dxaOrig="14416" w:dyaOrig="8161" w14:anchorId="58952338">
+        <w:object w:dxaOrig="14416" w:dyaOrig="8161" w14:anchorId="106C74A8">
           <v:shapetype id="_x0000_t75" coordsize="21600,21600" o:spt="75" o:preferrelative="t" path="m@4@5l@4@11@9@11@9@5xe" filled="f" stroked="f">
             <v:stroke joinstyle="miter"/>
             <v:formulas>
@@ -24,10 +24,10 @@
             <v:path o:extrusionok="f" gradientshapeok="t" o:connecttype="rect"/>
             <o:lock v:ext="edit" aspectratio="t"/>
           </v:shapetype>
-          <v:shape id="_x0000_i1028" type="#_x0000_t75" style="width:720.75pt;height:408pt" o:ole="">
+          <v:shape id="_x0000_i1028" type="#_x0000_t75" style="width:720.95pt;height:408.15pt" o:ole="">
             <v:imagedata r:id="rId4" o:title=""/>
           </v:shape>
-          <o:OLEObject Type="Embed" ProgID="Visio.Drawing.15" ShapeID="_x0000_i1028" DrawAspect="Content" ObjectID="_1853838173" r:id="rId5"/>
+          <o:OLEObject Type="Embed" ProgID="Visio.Drawing.15" ShapeID="_x0000_i1028" DrawAspect="Content" ObjectID="_1853856415" r:id="rId5"/>
         </w:object>
       </w:r>
     </w:p>
@@ -449,7 +449,7 @@
     <w:link w:val="Heading1Char"/>
     <w:uiPriority w:val="9"/>
     <w:qFormat/>
-    <w:rsid w:val="00DC3E06"/>
+    <w:rsid w:val="00A836E0"/>
     <w:pPr>
       <w:keepNext/>
       <w:keepLines/>
@@ -472,7 +472,7 @@
     <w:semiHidden/>
     <w:unhideWhenUsed/>
     <w:qFormat/>
-    <w:rsid w:val="00DC3E06"/>
+    <w:rsid w:val="00A836E0"/>
     <w:pPr>
       <w:keepNext/>
       <w:keepLines/>
@@ -495,7 +495,7 @@
     <w:semiHidden/>
     <w:unhideWhenUsed/>
     <w:qFormat/>
-    <w:rsid w:val="00DC3E06"/>
+    <w:rsid w:val="00A836E0"/>
     <w:pPr>
       <w:keepNext/>
       <w:keepLines/>
@@ -518,7 +518,7 @@
     <w:semiHidden/>
     <w:unhideWhenUsed/>
     <w:qFormat/>
-    <w:rsid w:val="00DC3E06"/>
+    <w:rsid w:val="00A836E0"/>
     <w:pPr>
       <w:keepNext/>
       <w:keepLines/>
@@ -541,7 +541,7 @@
     <w:semiHidden/>
     <w:unhideWhenUsed/>
     <w:qFormat/>
-    <w:rsid w:val="00DC3E06"/>
+    <w:rsid w:val="00A836E0"/>
     <w:pPr>
       <w:keepNext/>
       <w:keepLines/>
@@ -562,7 +562,7 @@
     <w:semiHidden/>
     <w:unhideWhenUsed/>
     <w:qFormat/>
-    <w:rsid w:val="00DC3E06"/>
+    <w:rsid w:val="00A836E0"/>
     <w:pPr>
       <w:keepNext/>
       <w:keepLines/>
@@ -585,7 +585,7 @@
     <w:semiHidden/>
     <w:unhideWhenUsed/>
     <w:qFormat/>
-    <w:rsid w:val="00DC3E06"/>
+    <w:rsid w:val="00A836E0"/>
     <w:pPr>
       <w:keepNext/>
       <w:keepLines/>
@@ -606,7 +606,7 @@
     <w:semiHidden/>
     <w:unhideWhenUsed/>
     <w:qFormat/>
-    <w:rsid w:val="00DC3E06"/>
+    <w:rsid w:val="00A836E0"/>
     <w:pPr>
       <w:keepNext/>
       <w:keepLines/>
@@ -629,7 +629,7 @@
     <w:semiHidden/>
     <w:unhideWhenUsed/>
     <w:qFormat/>
-    <w:rsid w:val="00DC3E06"/>
+    <w:rsid w:val="00A836E0"/>
     <w:pPr>
       <w:keepNext/>
       <w:keepLines/>
@@ -668,12 +668,56 @@
     <w:semiHidden/>
     <w:unhideWhenUsed/>
   </w:style>
+  <w:style w:type="table" w:customStyle="1" w:styleId="SensicalTable1">
+    <w:name w:val="Sensical Table 1"/>
+    <w:basedOn w:val="TableNormal"/>
+    <w:uiPriority w:val="99"/>
+    <w:rsid w:val="00287509"/>
+    <w:pPr>
+      <w:spacing w:before="60" w:after="60" w:line="240" w:lineRule="auto"/>
+      <w:jc w:val="both"/>
+    </w:pPr>
+    <w:rPr>
+      <w:kern w:val="0"/>
+      <w:sz w:val="22"/>
+      <w:szCs w:val="22"/>
+      <w14:ligatures w14:val="none"/>
+    </w:rPr>
+    <w:tblPr>
+      <w:tblStyleRowBandSize w:val="1"/>
+      <w:tblStyleColBandSize w:val="1"/>
+      <w:tblBorders>
+        <w:top w:val="single" w:sz="4" w:space="0" w:color="252666"/>
+        <w:left w:val="single" w:sz="4" w:space="0" w:color="252666"/>
+        <w:bottom w:val="single" w:sz="4" w:space="0" w:color="252666"/>
+        <w:right w:val="single" w:sz="4" w:space="0" w:color="252666"/>
+        <w:insideH w:val="single" w:sz="4" w:space="0" w:color="252666"/>
+        <w:insideV w:val="single" w:sz="4" w:space="0" w:color="252666"/>
+      </w:tblBorders>
+    </w:tblPr>
+    <w:tblStylePr w:type="firstRow">
+      <w:pPr>
+        <w:wordWrap/>
+        <w:spacing w:beforeLines="0" w:before="60" w:beforeAutospacing="0" w:afterLines="0" w:after="60" w:afterAutospacing="0"/>
+      </w:pPr>
+      <w:rPr>
+        <w:rFonts w:ascii="Calibri" w:hAnsi="Calibri"/>
+        <w:b/>
+        <w:color w:val="auto"/>
+        <w:sz w:val="22"/>
+      </w:rPr>
+      <w:tblPr/>
+      <w:tcPr>
+        <w:shd w:val="clear" w:color="auto" w:fill="C1E4F5" w:themeFill="accent1" w:themeFillTint="33"/>
+      </w:tcPr>
+    </w:tblStylePr>
+  </w:style>
   <w:style w:type="character" w:customStyle="1" w:styleId="Heading1Char">
     <w:name w:val="Heading 1 Char"/>
     <w:basedOn w:val="DefaultParagraphFont"/>
     <w:link w:val="Heading1"/>
     <w:uiPriority w:val="9"/>
-    <w:rsid w:val="00DC3E06"/>
+    <w:rsid w:val="00A836E0"/>
     <w:rPr>
       <w:rFonts w:asciiTheme="majorHAnsi" w:eastAsiaTheme="majorEastAsia" w:hAnsiTheme="majorHAnsi" w:cstheme="majorBidi"/>
       <w:color w:val="0F4761" w:themeColor="accent1" w:themeShade="BF"/>
@@ -687,7 +731,7 @@
     <w:link w:val="Heading2"/>
     <w:uiPriority w:val="9"/>
     <w:semiHidden/>
-    <w:rsid w:val="00DC3E06"/>
+    <w:rsid w:val="00A836E0"/>
     <w:rPr>
       <w:rFonts w:asciiTheme="majorHAnsi" w:eastAsiaTheme="majorEastAsia" w:hAnsiTheme="majorHAnsi" w:cstheme="majorBidi"/>
       <w:color w:val="0F4761" w:themeColor="accent1" w:themeShade="BF"/>
@@ -701,7 +745,7 @@
     <w:link w:val="Heading3"/>
     <w:uiPriority w:val="9"/>
     <w:semiHidden/>
-    <w:rsid w:val="00DC3E06"/>
+    <w:rsid w:val="00A836E0"/>
     <w:rPr>
       <w:rFonts w:eastAsiaTheme="majorEastAsia" w:cstheme="majorBidi"/>
       <w:color w:val="0F4761" w:themeColor="accent1" w:themeShade="BF"/>
@@ -715,7 +759,7 @@
     <w:link w:val="Heading4"/>
     <w:uiPriority w:val="9"/>
     <w:semiHidden/>
-    <w:rsid w:val="00DC3E06"/>
+    <w:rsid w:val="00A836E0"/>
     <w:rPr>
       <w:rFonts w:eastAsiaTheme="majorEastAsia" w:cstheme="majorBidi"/>
       <w:i/>
@@ -729,7 +773,7 @@
     <w:link w:val="Heading5"/>
     <w:uiPriority w:val="9"/>
     <w:semiHidden/>
-    <w:rsid w:val="00DC3E06"/>
+    <w:rsid w:val="00A836E0"/>
     <w:rPr>
       <w:rFonts w:eastAsiaTheme="majorEastAsia" w:cstheme="majorBidi"/>
       <w:color w:val="0F4761" w:themeColor="accent1" w:themeShade="BF"/>
@@ -741,7 +785,7 @@
     <w:link w:val="Heading6"/>
     <w:uiPriority w:val="9"/>
     <w:semiHidden/>
-    <w:rsid w:val="00DC3E06"/>
+    <w:rsid w:val="00A836E0"/>
     <w:rPr>
       <w:rFonts w:eastAsiaTheme="majorEastAsia" w:cstheme="majorBidi"/>
       <w:i/>
@@ -755,7 +799,7 @@
     <w:link w:val="Heading7"/>
     <w:uiPriority w:val="9"/>
     <w:semiHidden/>
-    <w:rsid w:val="00DC3E06"/>
+    <w:rsid w:val="00A836E0"/>
     <w:rPr>
       <w:rFonts w:eastAsiaTheme="majorEastAsia" w:cstheme="majorBidi"/>
       <w:color w:val="595959" w:themeColor="text1" w:themeTint="A6"/>
@@ -767,7 +811,7 @@
     <w:link w:val="Heading8"/>
     <w:uiPriority w:val="9"/>
     <w:semiHidden/>
-    <w:rsid w:val="00DC3E06"/>
+    <w:rsid w:val="00A836E0"/>
     <w:rPr>
       <w:rFonts w:eastAsiaTheme="majorEastAsia" w:cstheme="majorBidi"/>
       <w:i/>
@@ -781,7 +825,7 @@
     <w:link w:val="Heading9"/>
     <w:uiPriority w:val="9"/>
     <w:semiHidden/>
-    <w:rsid w:val="00DC3E06"/>
+    <w:rsid w:val="00A836E0"/>
     <w:rPr>
       <w:rFonts w:eastAsiaTheme="majorEastAsia" w:cstheme="majorBidi"/>
       <w:color w:val="272727" w:themeColor="text1" w:themeTint="D8"/>
@@ -794,7 +838,7 @@
     <w:link w:val="TitleChar"/>
     <w:uiPriority w:val="10"/>
     <w:qFormat/>
-    <w:rsid w:val="00DC3E06"/>
+    <w:rsid w:val="00A836E0"/>
     <w:pPr>
       <w:spacing w:after="80" w:line="240" w:lineRule="auto"/>
       <w:contextualSpacing/>
@@ -812,7 +856,7 @@
     <w:basedOn w:val="DefaultParagraphFont"/>
     <w:link w:val="Title"/>
     <w:uiPriority w:val="10"/>
-    <w:rsid w:val="00DC3E06"/>
+    <w:rsid w:val="00A836E0"/>
     <w:rPr>
       <w:rFonts w:asciiTheme="majorHAnsi" w:eastAsiaTheme="majorEastAsia" w:hAnsiTheme="majorHAnsi" w:cstheme="majorBidi"/>
       <w:spacing w:val="-10"/>
@@ -828,7 +872,7 @@
     <w:link w:val="SubtitleChar"/>
     <w:uiPriority w:val="11"/>
     <w:qFormat/>
-    <w:rsid w:val="00DC3E06"/>
+    <w:rsid w:val="00A836E0"/>
     <w:pPr>
       <w:numPr>
         <w:ilvl w:val="1"/>
@@ -847,7 +891,7 @@
     <w:basedOn w:val="DefaultParagraphFont"/>
     <w:link w:val="Subtitle"/>
     <w:uiPriority w:val="11"/>
-    <w:rsid w:val="00DC3E06"/>
+    <w:rsid w:val="00A836E0"/>
     <w:rPr>
       <w:rFonts w:eastAsiaTheme="majorEastAsia" w:cstheme="majorBidi"/>
       <w:color w:val="595959" w:themeColor="text1" w:themeTint="A6"/>
@@ -863,7 +907,7 @@
     <w:link w:val="QuoteChar"/>
     <w:uiPriority w:val="29"/>
     <w:qFormat/>
-    <w:rsid w:val="00DC3E06"/>
+    <w:rsid w:val="00A836E0"/>
     <w:pPr>
       <w:spacing w:before="160"/>
       <w:jc w:val="center"/>
@@ -879,7 +923,7 @@
     <w:basedOn w:val="DefaultParagraphFont"/>
     <w:link w:val="Quote"/>
     <w:uiPriority w:val="29"/>
-    <w:rsid w:val="00DC3E06"/>
+    <w:rsid w:val="00A836E0"/>
     <w:rPr>
       <w:i/>
       <w:iCs/>
@@ -891,7 +935,7 @@
     <w:basedOn w:val="Normal"/>
     <w:uiPriority w:val="34"/>
     <w:qFormat/>
-    <w:rsid w:val="00DC3E06"/>
+    <w:rsid w:val="00A836E0"/>
     <w:pPr>
       <w:ind w:left="720"/>
       <w:contextualSpacing/>
@@ -902,7 +946,7 @@
     <w:basedOn w:val="DefaultParagraphFont"/>
     <w:uiPriority w:val="21"/>
     <w:qFormat/>
-    <w:rsid w:val="00DC3E06"/>
+    <w:rsid w:val="00A836E0"/>
     <w:rPr>
       <w:i/>
       <w:iCs/>
@@ -916,7 +960,7 @@
     <w:link w:val="IntenseQuoteChar"/>
     <w:uiPriority w:val="30"/>
     <w:qFormat/>
-    <w:rsid w:val="00DC3E06"/>
+    <w:rsid w:val="00A836E0"/>
     <w:pPr>
       <w:pBdr>
         <w:top w:val="single" w:sz="4" w:space="10" w:color="0F4761" w:themeColor="accent1" w:themeShade="BF"/>
@@ -937,7 +981,7 @@
     <w:basedOn w:val="DefaultParagraphFont"/>
     <w:link w:val="IntenseQuote"/>
     <w:uiPriority w:val="30"/>
-    <w:rsid w:val="00DC3E06"/>
+    <w:rsid w:val="00A836E0"/>
     <w:rPr>
       <w:i/>
       <w:iCs/>
@@ -949,7 +993,7 @@
     <w:basedOn w:val="DefaultParagraphFont"/>
     <w:uiPriority w:val="32"/>
     <w:qFormat/>
-    <w:rsid w:val="00DC3E06"/>
+    <w:rsid w:val="00A836E0"/>
     <w:rPr>
       <w:b/>
       <w:bCs/>

</xml_diff>

<commit_message>
feat(w02b): tabs for open documents with per-tab close, New and Open as tabs (#41)
Co-Authored-By: Claude Sonnet 5.5 <noreply@anthropic.com>
</commit_message>
<xml_diff>
--- a/docs/acceptance/evidence/DEMO/demo.docx
+++ b/docs/acceptance/evidence/DEMO/demo.docx
@@ -4,7 +4,7 @@
   <w:body>
     <w:p>
       <w:r>
-        <w:object w:dxaOrig="14416" w:dyaOrig="8161" w14:anchorId="106C74A8">
+        <w:object w:dxaOrig="14415" w:dyaOrig="8161" w14:anchorId="3F4A8766">
           <v:shapetype id="_x0000_t75" coordsize="21600,21600" o:spt="75" o:preferrelative="t" path="m@4@5l@4@11@9@11@9@5xe" filled="f" stroked="f">
             <v:stroke joinstyle="miter"/>
             <v:formulas>
@@ -27,7 +27,7 @@
           <v:shape id="_x0000_i1028" type="#_x0000_t75" style="width:720.95pt;height:408.15pt" o:ole="">
             <v:imagedata r:id="rId4" o:title=""/>
           </v:shape>
-          <o:OLEObject Type="Embed" ProgID="Visio.Drawing.15" ShapeID="_x0000_i1028" DrawAspect="Content" ObjectID="_1853856415" r:id="rId5"/>
+          <o:OLEObject Type="Embed" ProgID="Visio.Drawing.15" ShapeID="_x0000_i1028" DrawAspect="Content" ObjectID="_1853858531" r:id="rId5"/>
         </w:object>
       </w:r>
     </w:p>
@@ -449,7 +449,7 @@
     <w:link w:val="Heading1Char"/>
     <w:uiPriority w:val="9"/>
     <w:qFormat/>
-    <w:rsid w:val="00A836E0"/>
+    <w:rsid w:val="00A47D71"/>
     <w:pPr>
       <w:keepNext/>
       <w:keepLines/>
@@ -472,7 +472,7 @@
     <w:semiHidden/>
     <w:unhideWhenUsed/>
     <w:qFormat/>
-    <w:rsid w:val="00A836E0"/>
+    <w:rsid w:val="00A47D71"/>
     <w:pPr>
       <w:keepNext/>
       <w:keepLines/>
@@ -495,7 +495,7 @@
     <w:semiHidden/>
     <w:unhideWhenUsed/>
     <w:qFormat/>
-    <w:rsid w:val="00A836E0"/>
+    <w:rsid w:val="00A47D71"/>
     <w:pPr>
       <w:keepNext/>
       <w:keepLines/>
@@ -518,7 +518,7 @@
     <w:semiHidden/>
     <w:unhideWhenUsed/>
     <w:qFormat/>
-    <w:rsid w:val="00A836E0"/>
+    <w:rsid w:val="00A47D71"/>
     <w:pPr>
       <w:keepNext/>
       <w:keepLines/>
@@ -541,7 +541,7 @@
     <w:semiHidden/>
     <w:unhideWhenUsed/>
     <w:qFormat/>
-    <w:rsid w:val="00A836E0"/>
+    <w:rsid w:val="00A47D71"/>
     <w:pPr>
       <w:keepNext/>
       <w:keepLines/>
@@ -562,7 +562,7 @@
     <w:semiHidden/>
     <w:unhideWhenUsed/>
     <w:qFormat/>
-    <w:rsid w:val="00A836E0"/>
+    <w:rsid w:val="00A47D71"/>
     <w:pPr>
       <w:keepNext/>
       <w:keepLines/>
@@ -585,7 +585,7 @@
     <w:semiHidden/>
     <w:unhideWhenUsed/>
     <w:qFormat/>
-    <w:rsid w:val="00A836E0"/>
+    <w:rsid w:val="00A47D71"/>
     <w:pPr>
       <w:keepNext/>
       <w:keepLines/>
@@ -606,7 +606,7 @@
     <w:semiHidden/>
     <w:unhideWhenUsed/>
     <w:qFormat/>
-    <w:rsid w:val="00A836E0"/>
+    <w:rsid w:val="00A47D71"/>
     <w:pPr>
       <w:keepNext/>
       <w:keepLines/>
@@ -629,7 +629,7 @@
     <w:semiHidden/>
     <w:unhideWhenUsed/>
     <w:qFormat/>
-    <w:rsid w:val="00A836E0"/>
+    <w:rsid w:val="00A47D71"/>
     <w:pPr>
       <w:keepNext/>
       <w:keepLines/>
@@ -717,7 +717,7 @@
     <w:basedOn w:val="DefaultParagraphFont"/>
     <w:link w:val="Heading1"/>
     <w:uiPriority w:val="9"/>
-    <w:rsid w:val="00A836E0"/>
+    <w:rsid w:val="00A47D71"/>
     <w:rPr>
       <w:rFonts w:asciiTheme="majorHAnsi" w:eastAsiaTheme="majorEastAsia" w:hAnsiTheme="majorHAnsi" w:cstheme="majorBidi"/>
       <w:color w:val="0F4761" w:themeColor="accent1" w:themeShade="BF"/>
@@ -731,7 +731,7 @@
     <w:link w:val="Heading2"/>
     <w:uiPriority w:val="9"/>
     <w:semiHidden/>
-    <w:rsid w:val="00A836E0"/>
+    <w:rsid w:val="00A47D71"/>
     <w:rPr>
       <w:rFonts w:asciiTheme="majorHAnsi" w:eastAsiaTheme="majorEastAsia" w:hAnsiTheme="majorHAnsi" w:cstheme="majorBidi"/>
       <w:color w:val="0F4761" w:themeColor="accent1" w:themeShade="BF"/>
@@ -745,7 +745,7 @@
     <w:link w:val="Heading3"/>
     <w:uiPriority w:val="9"/>
     <w:semiHidden/>
-    <w:rsid w:val="00A836E0"/>
+    <w:rsid w:val="00A47D71"/>
     <w:rPr>
       <w:rFonts w:eastAsiaTheme="majorEastAsia" w:cstheme="majorBidi"/>
       <w:color w:val="0F4761" w:themeColor="accent1" w:themeShade="BF"/>
@@ -759,7 +759,7 @@
     <w:link w:val="Heading4"/>
     <w:uiPriority w:val="9"/>
     <w:semiHidden/>
-    <w:rsid w:val="00A836E0"/>
+    <w:rsid w:val="00A47D71"/>
     <w:rPr>
       <w:rFonts w:eastAsiaTheme="majorEastAsia" w:cstheme="majorBidi"/>
       <w:i/>
@@ -773,7 +773,7 @@
     <w:link w:val="Heading5"/>
     <w:uiPriority w:val="9"/>
     <w:semiHidden/>
-    <w:rsid w:val="00A836E0"/>
+    <w:rsid w:val="00A47D71"/>
     <w:rPr>
       <w:rFonts w:eastAsiaTheme="majorEastAsia" w:cstheme="majorBidi"/>
       <w:color w:val="0F4761" w:themeColor="accent1" w:themeShade="BF"/>
@@ -785,7 +785,7 @@
     <w:link w:val="Heading6"/>
     <w:uiPriority w:val="9"/>
     <w:semiHidden/>
-    <w:rsid w:val="00A836E0"/>
+    <w:rsid w:val="00A47D71"/>
     <w:rPr>
       <w:rFonts w:eastAsiaTheme="majorEastAsia" w:cstheme="majorBidi"/>
       <w:i/>
@@ -799,7 +799,7 @@
     <w:link w:val="Heading7"/>
     <w:uiPriority w:val="9"/>
     <w:semiHidden/>
-    <w:rsid w:val="00A836E0"/>
+    <w:rsid w:val="00A47D71"/>
     <w:rPr>
       <w:rFonts w:eastAsiaTheme="majorEastAsia" w:cstheme="majorBidi"/>
       <w:color w:val="595959" w:themeColor="text1" w:themeTint="A6"/>
@@ -811,7 +811,7 @@
     <w:link w:val="Heading8"/>
     <w:uiPriority w:val="9"/>
     <w:semiHidden/>
-    <w:rsid w:val="00A836E0"/>
+    <w:rsid w:val="00A47D71"/>
     <w:rPr>
       <w:rFonts w:eastAsiaTheme="majorEastAsia" w:cstheme="majorBidi"/>
       <w:i/>
@@ -825,7 +825,7 @@
     <w:link w:val="Heading9"/>
     <w:uiPriority w:val="9"/>
     <w:semiHidden/>
-    <w:rsid w:val="00A836E0"/>
+    <w:rsid w:val="00A47D71"/>
     <w:rPr>
       <w:rFonts w:eastAsiaTheme="majorEastAsia" w:cstheme="majorBidi"/>
       <w:color w:val="272727" w:themeColor="text1" w:themeTint="D8"/>
@@ -838,7 +838,7 @@
     <w:link w:val="TitleChar"/>
     <w:uiPriority w:val="10"/>
     <w:qFormat/>
-    <w:rsid w:val="00A836E0"/>
+    <w:rsid w:val="00A47D71"/>
     <w:pPr>
       <w:spacing w:after="80" w:line="240" w:lineRule="auto"/>
       <w:contextualSpacing/>
@@ -856,7 +856,7 @@
     <w:basedOn w:val="DefaultParagraphFont"/>
     <w:link w:val="Title"/>
     <w:uiPriority w:val="10"/>
-    <w:rsid w:val="00A836E0"/>
+    <w:rsid w:val="00A47D71"/>
     <w:rPr>
       <w:rFonts w:asciiTheme="majorHAnsi" w:eastAsiaTheme="majorEastAsia" w:hAnsiTheme="majorHAnsi" w:cstheme="majorBidi"/>
       <w:spacing w:val="-10"/>
@@ -872,7 +872,7 @@
     <w:link w:val="SubtitleChar"/>
     <w:uiPriority w:val="11"/>
     <w:qFormat/>
-    <w:rsid w:val="00A836E0"/>
+    <w:rsid w:val="00A47D71"/>
     <w:pPr>
       <w:numPr>
         <w:ilvl w:val="1"/>
@@ -891,7 +891,7 @@
     <w:basedOn w:val="DefaultParagraphFont"/>
     <w:link w:val="Subtitle"/>
     <w:uiPriority w:val="11"/>
-    <w:rsid w:val="00A836E0"/>
+    <w:rsid w:val="00A47D71"/>
     <w:rPr>
       <w:rFonts w:eastAsiaTheme="majorEastAsia" w:cstheme="majorBidi"/>
       <w:color w:val="595959" w:themeColor="text1" w:themeTint="A6"/>
@@ -907,7 +907,7 @@
     <w:link w:val="QuoteChar"/>
     <w:uiPriority w:val="29"/>
     <w:qFormat/>
-    <w:rsid w:val="00A836E0"/>
+    <w:rsid w:val="00A47D71"/>
     <w:pPr>
       <w:spacing w:before="160"/>
       <w:jc w:val="center"/>
@@ -923,7 +923,7 @@
     <w:basedOn w:val="DefaultParagraphFont"/>
     <w:link w:val="Quote"/>
     <w:uiPriority w:val="29"/>
-    <w:rsid w:val="00A836E0"/>
+    <w:rsid w:val="00A47D71"/>
     <w:rPr>
       <w:i/>
       <w:iCs/>
@@ -935,7 +935,7 @@
     <w:basedOn w:val="Normal"/>
     <w:uiPriority w:val="34"/>
     <w:qFormat/>
-    <w:rsid w:val="00A836E0"/>
+    <w:rsid w:val="00A47D71"/>
     <w:pPr>
       <w:ind w:left="720"/>
       <w:contextualSpacing/>
@@ -946,7 +946,7 @@
     <w:basedOn w:val="DefaultParagraphFont"/>
     <w:uiPriority w:val="21"/>
     <w:qFormat/>
-    <w:rsid w:val="00A836E0"/>
+    <w:rsid w:val="00A47D71"/>
     <w:rPr>
       <w:i/>
       <w:iCs/>
@@ -960,7 +960,7 @@
     <w:link w:val="IntenseQuoteChar"/>
     <w:uiPriority w:val="30"/>
     <w:qFormat/>
-    <w:rsid w:val="00A836E0"/>
+    <w:rsid w:val="00A47D71"/>
     <w:pPr>
       <w:pBdr>
         <w:top w:val="single" w:sz="4" w:space="10" w:color="0F4761" w:themeColor="accent1" w:themeShade="BF"/>
@@ -981,7 +981,7 @@
     <w:basedOn w:val="DefaultParagraphFont"/>
     <w:link w:val="IntenseQuote"/>
     <w:uiPriority w:val="30"/>
-    <w:rsid w:val="00A836E0"/>
+    <w:rsid w:val="00A47D71"/>
     <w:rPr>
       <w:i/>
       <w:iCs/>
@@ -993,7 +993,7 @@
     <w:basedOn w:val="DefaultParagraphFont"/>
     <w:uiPriority w:val="32"/>
     <w:qFormat/>
-    <w:rsid w:val="00A836E0"/>
+    <w:rsid w:val="00A47D71"/>
     <w:rPr>
       <w:b/>
       <w:bCs/>

</xml_diff>

<commit_message>
feat(w02c): remember open tabs, restore them at start, silent window close (#42)
Co-Authored-By: Claude Sonnet 5.5 <noreply@anthropic.com>
</commit_message>
<xml_diff>
--- a/docs/acceptance/evidence/DEMO/demo.docx
+++ b/docs/acceptance/evidence/DEMO/demo.docx
@@ -4,7 +4,7 @@
   <w:body>
     <w:p>
       <w:r>
-        <w:object w:dxaOrig="14415" w:dyaOrig="8161" w14:anchorId="3F4A8766">
+        <w:object w:dxaOrig="14416" w:dyaOrig="8161" w14:anchorId="7D24EF1E">
           <v:shapetype id="_x0000_t75" coordsize="21600,21600" o:spt="75" o:preferrelative="t" path="m@4@5l@4@11@9@11@9@5xe" filled="f" stroked="f">
             <v:stroke joinstyle="miter"/>
             <v:formulas>
@@ -27,7 +27,7 @@
           <v:shape id="_x0000_i1028" type="#_x0000_t75" style="width:720.95pt;height:408.15pt" o:ole="">
             <v:imagedata r:id="rId4" o:title=""/>
           </v:shape>
-          <o:OLEObject Type="Embed" ProgID="Visio.Drawing.15" ShapeID="_x0000_i1028" DrawAspect="Content" ObjectID="_1853858531" r:id="rId5"/>
+          <o:OLEObject Type="Embed" ProgID="Visio.Drawing.15" ShapeID="_x0000_i1028" DrawAspect="Content" ObjectID="_1853860082" r:id="rId5"/>
         </w:object>
       </w:r>
     </w:p>
@@ -449,7 +449,7 @@
     <w:link w:val="Heading1Char"/>
     <w:uiPriority w:val="9"/>
     <w:qFormat/>
-    <w:rsid w:val="00A47D71"/>
+    <w:rsid w:val="00F822BF"/>
     <w:pPr>
       <w:keepNext/>
       <w:keepLines/>
@@ -472,7 +472,7 @@
     <w:semiHidden/>
     <w:unhideWhenUsed/>
     <w:qFormat/>
-    <w:rsid w:val="00A47D71"/>
+    <w:rsid w:val="00F822BF"/>
     <w:pPr>
       <w:keepNext/>
       <w:keepLines/>
@@ -495,7 +495,7 @@
     <w:semiHidden/>
     <w:unhideWhenUsed/>
     <w:qFormat/>
-    <w:rsid w:val="00A47D71"/>
+    <w:rsid w:val="00F822BF"/>
     <w:pPr>
       <w:keepNext/>
       <w:keepLines/>
@@ -518,7 +518,7 @@
     <w:semiHidden/>
     <w:unhideWhenUsed/>
     <w:qFormat/>
-    <w:rsid w:val="00A47D71"/>
+    <w:rsid w:val="00F822BF"/>
     <w:pPr>
       <w:keepNext/>
       <w:keepLines/>
@@ -541,7 +541,7 @@
     <w:semiHidden/>
     <w:unhideWhenUsed/>
     <w:qFormat/>
-    <w:rsid w:val="00A47D71"/>
+    <w:rsid w:val="00F822BF"/>
     <w:pPr>
       <w:keepNext/>
       <w:keepLines/>
@@ -562,7 +562,7 @@
     <w:semiHidden/>
     <w:unhideWhenUsed/>
     <w:qFormat/>
-    <w:rsid w:val="00A47D71"/>
+    <w:rsid w:val="00F822BF"/>
     <w:pPr>
       <w:keepNext/>
       <w:keepLines/>
@@ -585,7 +585,7 @@
     <w:semiHidden/>
     <w:unhideWhenUsed/>
     <w:qFormat/>
-    <w:rsid w:val="00A47D71"/>
+    <w:rsid w:val="00F822BF"/>
     <w:pPr>
       <w:keepNext/>
       <w:keepLines/>
@@ -606,7 +606,7 @@
     <w:semiHidden/>
     <w:unhideWhenUsed/>
     <w:qFormat/>
-    <w:rsid w:val="00A47D71"/>
+    <w:rsid w:val="00F822BF"/>
     <w:pPr>
       <w:keepNext/>
       <w:keepLines/>
@@ -629,7 +629,7 @@
     <w:semiHidden/>
     <w:unhideWhenUsed/>
     <w:qFormat/>
-    <w:rsid w:val="00A47D71"/>
+    <w:rsid w:val="00F822BF"/>
     <w:pPr>
       <w:keepNext/>
       <w:keepLines/>
@@ -717,7 +717,7 @@
     <w:basedOn w:val="DefaultParagraphFont"/>
     <w:link w:val="Heading1"/>
     <w:uiPriority w:val="9"/>
-    <w:rsid w:val="00A47D71"/>
+    <w:rsid w:val="00F822BF"/>
     <w:rPr>
       <w:rFonts w:asciiTheme="majorHAnsi" w:eastAsiaTheme="majorEastAsia" w:hAnsiTheme="majorHAnsi" w:cstheme="majorBidi"/>
       <w:color w:val="0F4761" w:themeColor="accent1" w:themeShade="BF"/>
@@ -731,7 +731,7 @@
     <w:link w:val="Heading2"/>
     <w:uiPriority w:val="9"/>
     <w:semiHidden/>
-    <w:rsid w:val="00A47D71"/>
+    <w:rsid w:val="00F822BF"/>
     <w:rPr>
       <w:rFonts w:asciiTheme="majorHAnsi" w:eastAsiaTheme="majorEastAsia" w:hAnsiTheme="majorHAnsi" w:cstheme="majorBidi"/>
       <w:color w:val="0F4761" w:themeColor="accent1" w:themeShade="BF"/>
@@ -745,7 +745,7 @@
     <w:link w:val="Heading3"/>
     <w:uiPriority w:val="9"/>
     <w:semiHidden/>
-    <w:rsid w:val="00A47D71"/>
+    <w:rsid w:val="00F822BF"/>
     <w:rPr>
       <w:rFonts w:eastAsiaTheme="majorEastAsia" w:cstheme="majorBidi"/>
       <w:color w:val="0F4761" w:themeColor="accent1" w:themeShade="BF"/>
@@ -759,7 +759,7 @@
     <w:link w:val="Heading4"/>
     <w:uiPriority w:val="9"/>
     <w:semiHidden/>
-    <w:rsid w:val="00A47D71"/>
+    <w:rsid w:val="00F822BF"/>
     <w:rPr>
       <w:rFonts w:eastAsiaTheme="majorEastAsia" w:cstheme="majorBidi"/>
       <w:i/>
@@ -773,7 +773,7 @@
     <w:link w:val="Heading5"/>
     <w:uiPriority w:val="9"/>
     <w:semiHidden/>
-    <w:rsid w:val="00A47D71"/>
+    <w:rsid w:val="00F822BF"/>
     <w:rPr>
       <w:rFonts w:eastAsiaTheme="majorEastAsia" w:cstheme="majorBidi"/>
       <w:color w:val="0F4761" w:themeColor="accent1" w:themeShade="BF"/>
@@ -785,7 +785,7 @@
     <w:link w:val="Heading6"/>
     <w:uiPriority w:val="9"/>
     <w:semiHidden/>
-    <w:rsid w:val="00A47D71"/>
+    <w:rsid w:val="00F822BF"/>
     <w:rPr>
       <w:rFonts w:eastAsiaTheme="majorEastAsia" w:cstheme="majorBidi"/>
       <w:i/>
@@ -799,7 +799,7 @@
     <w:link w:val="Heading7"/>
     <w:uiPriority w:val="9"/>
     <w:semiHidden/>
-    <w:rsid w:val="00A47D71"/>
+    <w:rsid w:val="00F822BF"/>
     <w:rPr>
       <w:rFonts w:eastAsiaTheme="majorEastAsia" w:cstheme="majorBidi"/>
       <w:color w:val="595959" w:themeColor="text1" w:themeTint="A6"/>
@@ -811,7 +811,7 @@
     <w:link w:val="Heading8"/>
     <w:uiPriority w:val="9"/>
     <w:semiHidden/>
-    <w:rsid w:val="00A47D71"/>
+    <w:rsid w:val="00F822BF"/>
     <w:rPr>
       <w:rFonts w:eastAsiaTheme="majorEastAsia" w:cstheme="majorBidi"/>
       <w:i/>
@@ -825,7 +825,7 @@
     <w:link w:val="Heading9"/>
     <w:uiPriority w:val="9"/>
     <w:semiHidden/>
-    <w:rsid w:val="00A47D71"/>
+    <w:rsid w:val="00F822BF"/>
     <w:rPr>
       <w:rFonts w:eastAsiaTheme="majorEastAsia" w:cstheme="majorBidi"/>
       <w:color w:val="272727" w:themeColor="text1" w:themeTint="D8"/>
@@ -838,7 +838,7 @@
     <w:link w:val="TitleChar"/>
     <w:uiPriority w:val="10"/>
     <w:qFormat/>
-    <w:rsid w:val="00A47D71"/>
+    <w:rsid w:val="00F822BF"/>
     <w:pPr>
       <w:spacing w:after="80" w:line="240" w:lineRule="auto"/>
       <w:contextualSpacing/>
@@ -856,7 +856,7 @@
     <w:basedOn w:val="DefaultParagraphFont"/>
     <w:link w:val="Title"/>
     <w:uiPriority w:val="10"/>
-    <w:rsid w:val="00A47D71"/>
+    <w:rsid w:val="00F822BF"/>
     <w:rPr>
       <w:rFonts w:asciiTheme="majorHAnsi" w:eastAsiaTheme="majorEastAsia" w:hAnsiTheme="majorHAnsi" w:cstheme="majorBidi"/>
       <w:spacing w:val="-10"/>
@@ -872,7 +872,7 @@
     <w:link w:val="SubtitleChar"/>
     <w:uiPriority w:val="11"/>
     <w:qFormat/>
-    <w:rsid w:val="00A47D71"/>
+    <w:rsid w:val="00F822BF"/>
     <w:pPr>
       <w:numPr>
         <w:ilvl w:val="1"/>
@@ -891,7 +891,7 @@
     <w:basedOn w:val="DefaultParagraphFont"/>
     <w:link w:val="Subtitle"/>
     <w:uiPriority w:val="11"/>
-    <w:rsid w:val="00A47D71"/>
+    <w:rsid w:val="00F822BF"/>
     <w:rPr>
       <w:rFonts w:eastAsiaTheme="majorEastAsia" w:cstheme="majorBidi"/>
       <w:color w:val="595959" w:themeColor="text1" w:themeTint="A6"/>
@@ -907,7 +907,7 @@
     <w:link w:val="QuoteChar"/>
     <w:uiPriority w:val="29"/>
     <w:qFormat/>
-    <w:rsid w:val="00A47D71"/>
+    <w:rsid w:val="00F822BF"/>
     <w:pPr>
       <w:spacing w:before="160"/>
       <w:jc w:val="center"/>
@@ -923,7 +923,7 @@
     <w:basedOn w:val="DefaultParagraphFont"/>
     <w:link w:val="Quote"/>
     <w:uiPriority w:val="29"/>
-    <w:rsid w:val="00A47D71"/>
+    <w:rsid w:val="00F822BF"/>
     <w:rPr>
       <w:i/>
       <w:iCs/>
@@ -935,7 +935,7 @@
     <w:basedOn w:val="Normal"/>
     <w:uiPriority w:val="34"/>
     <w:qFormat/>
-    <w:rsid w:val="00A47D71"/>
+    <w:rsid w:val="00F822BF"/>
     <w:pPr>
       <w:ind w:left="720"/>
       <w:contextualSpacing/>
@@ -946,7 +946,7 @@
     <w:basedOn w:val="DefaultParagraphFont"/>
     <w:uiPriority w:val="21"/>
     <w:qFormat/>
-    <w:rsid w:val="00A47D71"/>
+    <w:rsid w:val="00F822BF"/>
     <w:rPr>
       <w:i/>
       <w:iCs/>
@@ -960,7 +960,7 @@
     <w:link w:val="IntenseQuoteChar"/>
     <w:uiPriority w:val="30"/>
     <w:qFormat/>
-    <w:rsid w:val="00A47D71"/>
+    <w:rsid w:val="00F822BF"/>
     <w:pPr>
       <w:pBdr>
         <w:top w:val="single" w:sz="4" w:space="10" w:color="0F4761" w:themeColor="accent1" w:themeShade="BF"/>
@@ -981,7 +981,7 @@
     <w:basedOn w:val="DefaultParagraphFont"/>
     <w:link w:val="IntenseQuote"/>
     <w:uiPriority w:val="30"/>
-    <w:rsid w:val="00A47D71"/>
+    <w:rsid w:val="00F822BF"/>
     <w:rPr>
       <w:i/>
       <w:iCs/>
@@ -993,7 +993,7 @@
     <w:basedOn w:val="DefaultParagraphFont"/>
     <w:uiPriority w:val="32"/>
     <w:qFormat/>
-    <w:rsid w:val="00A47D71"/>
+    <w:rsid w:val="00F822BF"/>
     <w:rPr>
       <w:b/>
       <w:bCs/>

</xml_diff>

<commit_message>
feat(w02d): agent-only WebView, document handover and MCP document tools (#43)
Co-Authored-By: Claude Sonnet 5.5 <noreply@anthropic.com>
</commit_message>
<xml_diff>
--- a/docs/acceptance/evidence/DEMO/demo.docx
+++ b/docs/acceptance/evidence/DEMO/demo.docx
@@ -4,7 +4,7 @@
   <w:body>
     <w:p>
       <w:r>
-        <w:object w:dxaOrig="14416" w:dyaOrig="8161" w14:anchorId="7D24EF1E">
+        <w:object w:dxaOrig="14416" w:dyaOrig="8161" w14:anchorId="619E9CF0">
           <v:shapetype id="_x0000_t75" coordsize="21600,21600" o:spt="75" o:preferrelative="t" path="m@4@5l@4@11@9@11@9@5xe" filled="f" stroked="f">
             <v:stroke joinstyle="miter"/>
             <v:formulas>
@@ -27,7 +27,7 @@
           <v:shape id="_x0000_i1028" type="#_x0000_t75" style="width:720.95pt;height:408.15pt" o:ole="">
             <v:imagedata r:id="rId4" o:title=""/>
           </v:shape>
-          <o:OLEObject Type="Embed" ProgID="Visio.Drawing.15" ShapeID="_x0000_i1028" DrawAspect="Content" ObjectID="_1853860082" r:id="rId5"/>
+          <o:OLEObject Type="Embed" ProgID="Visio.Drawing.15" ShapeID="_x0000_i1028" DrawAspect="Content" ObjectID="_1853861826" r:id="rId5"/>
         </w:object>
       </w:r>
     </w:p>
@@ -449,7 +449,7 @@
     <w:link w:val="Heading1Char"/>
     <w:uiPriority w:val="9"/>
     <w:qFormat/>
-    <w:rsid w:val="00F822BF"/>
+    <w:rsid w:val="00FE71CD"/>
     <w:pPr>
       <w:keepNext/>
       <w:keepLines/>
@@ -472,7 +472,7 @@
     <w:semiHidden/>
     <w:unhideWhenUsed/>
     <w:qFormat/>
-    <w:rsid w:val="00F822BF"/>
+    <w:rsid w:val="00FE71CD"/>
     <w:pPr>
       <w:keepNext/>
       <w:keepLines/>
@@ -495,7 +495,7 @@
     <w:semiHidden/>
     <w:unhideWhenUsed/>
     <w:qFormat/>
-    <w:rsid w:val="00F822BF"/>
+    <w:rsid w:val="00FE71CD"/>
     <w:pPr>
       <w:keepNext/>
       <w:keepLines/>
@@ -518,7 +518,7 @@
     <w:semiHidden/>
     <w:unhideWhenUsed/>
     <w:qFormat/>
-    <w:rsid w:val="00F822BF"/>
+    <w:rsid w:val="00FE71CD"/>
     <w:pPr>
       <w:keepNext/>
       <w:keepLines/>
@@ -541,7 +541,7 @@
     <w:semiHidden/>
     <w:unhideWhenUsed/>
     <w:qFormat/>
-    <w:rsid w:val="00F822BF"/>
+    <w:rsid w:val="00FE71CD"/>
     <w:pPr>
       <w:keepNext/>
       <w:keepLines/>
@@ -562,7 +562,7 @@
     <w:semiHidden/>
     <w:unhideWhenUsed/>
     <w:qFormat/>
-    <w:rsid w:val="00F822BF"/>
+    <w:rsid w:val="00FE71CD"/>
     <w:pPr>
       <w:keepNext/>
       <w:keepLines/>
@@ -585,7 +585,7 @@
     <w:semiHidden/>
     <w:unhideWhenUsed/>
     <w:qFormat/>
-    <w:rsid w:val="00F822BF"/>
+    <w:rsid w:val="00FE71CD"/>
     <w:pPr>
       <w:keepNext/>
       <w:keepLines/>
@@ -606,7 +606,7 @@
     <w:semiHidden/>
     <w:unhideWhenUsed/>
     <w:qFormat/>
-    <w:rsid w:val="00F822BF"/>
+    <w:rsid w:val="00FE71CD"/>
     <w:pPr>
       <w:keepNext/>
       <w:keepLines/>
@@ -629,7 +629,7 @@
     <w:semiHidden/>
     <w:unhideWhenUsed/>
     <w:qFormat/>
-    <w:rsid w:val="00F822BF"/>
+    <w:rsid w:val="00FE71CD"/>
     <w:pPr>
       <w:keepNext/>
       <w:keepLines/>
@@ -717,7 +717,7 @@
     <w:basedOn w:val="DefaultParagraphFont"/>
     <w:link w:val="Heading1"/>
     <w:uiPriority w:val="9"/>
-    <w:rsid w:val="00F822BF"/>
+    <w:rsid w:val="00FE71CD"/>
     <w:rPr>
       <w:rFonts w:asciiTheme="majorHAnsi" w:eastAsiaTheme="majorEastAsia" w:hAnsiTheme="majorHAnsi" w:cstheme="majorBidi"/>
       <w:color w:val="0F4761" w:themeColor="accent1" w:themeShade="BF"/>
@@ -731,7 +731,7 @@
     <w:link w:val="Heading2"/>
     <w:uiPriority w:val="9"/>
     <w:semiHidden/>
-    <w:rsid w:val="00F822BF"/>
+    <w:rsid w:val="00FE71CD"/>
     <w:rPr>
       <w:rFonts w:asciiTheme="majorHAnsi" w:eastAsiaTheme="majorEastAsia" w:hAnsiTheme="majorHAnsi" w:cstheme="majorBidi"/>
       <w:color w:val="0F4761" w:themeColor="accent1" w:themeShade="BF"/>
@@ -745,7 +745,7 @@
     <w:link w:val="Heading3"/>
     <w:uiPriority w:val="9"/>
     <w:semiHidden/>
-    <w:rsid w:val="00F822BF"/>
+    <w:rsid w:val="00FE71CD"/>
     <w:rPr>
       <w:rFonts w:eastAsiaTheme="majorEastAsia" w:cstheme="majorBidi"/>
       <w:color w:val="0F4761" w:themeColor="accent1" w:themeShade="BF"/>
@@ -759,7 +759,7 @@
     <w:link w:val="Heading4"/>
     <w:uiPriority w:val="9"/>
     <w:semiHidden/>
-    <w:rsid w:val="00F822BF"/>
+    <w:rsid w:val="00FE71CD"/>
     <w:rPr>
       <w:rFonts w:eastAsiaTheme="majorEastAsia" w:cstheme="majorBidi"/>
       <w:i/>
@@ -773,7 +773,7 @@
     <w:link w:val="Heading5"/>
     <w:uiPriority w:val="9"/>
     <w:semiHidden/>
-    <w:rsid w:val="00F822BF"/>
+    <w:rsid w:val="00FE71CD"/>
     <w:rPr>
       <w:rFonts w:eastAsiaTheme="majorEastAsia" w:cstheme="majorBidi"/>
       <w:color w:val="0F4761" w:themeColor="accent1" w:themeShade="BF"/>
@@ -785,7 +785,7 @@
     <w:link w:val="Heading6"/>
     <w:uiPriority w:val="9"/>
     <w:semiHidden/>
-    <w:rsid w:val="00F822BF"/>
+    <w:rsid w:val="00FE71CD"/>
     <w:rPr>
       <w:rFonts w:eastAsiaTheme="majorEastAsia" w:cstheme="majorBidi"/>
       <w:i/>
@@ -799,7 +799,7 @@
     <w:link w:val="Heading7"/>
     <w:uiPriority w:val="9"/>
     <w:semiHidden/>
-    <w:rsid w:val="00F822BF"/>
+    <w:rsid w:val="00FE71CD"/>
     <w:rPr>
       <w:rFonts w:eastAsiaTheme="majorEastAsia" w:cstheme="majorBidi"/>
       <w:color w:val="595959" w:themeColor="text1" w:themeTint="A6"/>
@@ -811,7 +811,7 @@
     <w:link w:val="Heading8"/>
     <w:uiPriority w:val="9"/>
     <w:semiHidden/>
-    <w:rsid w:val="00F822BF"/>
+    <w:rsid w:val="00FE71CD"/>
     <w:rPr>
       <w:rFonts w:eastAsiaTheme="majorEastAsia" w:cstheme="majorBidi"/>
       <w:i/>
@@ -825,7 +825,7 @@
     <w:link w:val="Heading9"/>
     <w:uiPriority w:val="9"/>
     <w:semiHidden/>
-    <w:rsid w:val="00F822BF"/>
+    <w:rsid w:val="00FE71CD"/>
     <w:rPr>
       <w:rFonts w:eastAsiaTheme="majorEastAsia" w:cstheme="majorBidi"/>
       <w:color w:val="272727" w:themeColor="text1" w:themeTint="D8"/>
@@ -838,7 +838,7 @@
     <w:link w:val="TitleChar"/>
     <w:uiPriority w:val="10"/>
     <w:qFormat/>
-    <w:rsid w:val="00F822BF"/>
+    <w:rsid w:val="00FE71CD"/>
     <w:pPr>
       <w:spacing w:after="80" w:line="240" w:lineRule="auto"/>
       <w:contextualSpacing/>
@@ -856,7 +856,7 @@
     <w:basedOn w:val="DefaultParagraphFont"/>
     <w:link w:val="Title"/>
     <w:uiPriority w:val="10"/>
-    <w:rsid w:val="00F822BF"/>
+    <w:rsid w:val="00FE71CD"/>
     <w:rPr>
       <w:rFonts w:asciiTheme="majorHAnsi" w:eastAsiaTheme="majorEastAsia" w:hAnsiTheme="majorHAnsi" w:cstheme="majorBidi"/>
       <w:spacing w:val="-10"/>
@@ -872,7 +872,7 @@
     <w:link w:val="SubtitleChar"/>
     <w:uiPriority w:val="11"/>
     <w:qFormat/>
-    <w:rsid w:val="00F822BF"/>
+    <w:rsid w:val="00FE71CD"/>
     <w:pPr>
       <w:numPr>
         <w:ilvl w:val="1"/>
@@ -891,7 +891,7 @@
     <w:basedOn w:val="DefaultParagraphFont"/>
     <w:link w:val="Subtitle"/>
     <w:uiPriority w:val="11"/>
-    <w:rsid w:val="00F822BF"/>
+    <w:rsid w:val="00FE71CD"/>
     <w:rPr>
       <w:rFonts w:eastAsiaTheme="majorEastAsia" w:cstheme="majorBidi"/>
       <w:color w:val="595959" w:themeColor="text1" w:themeTint="A6"/>
@@ -907,7 +907,7 @@
     <w:link w:val="QuoteChar"/>
     <w:uiPriority w:val="29"/>
     <w:qFormat/>
-    <w:rsid w:val="00F822BF"/>
+    <w:rsid w:val="00FE71CD"/>
     <w:pPr>
       <w:spacing w:before="160"/>
       <w:jc w:val="center"/>
@@ -923,7 +923,7 @@
     <w:basedOn w:val="DefaultParagraphFont"/>
     <w:link w:val="Quote"/>
     <w:uiPriority w:val="29"/>
-    <w:rsid w:val="00F822BF"/>
+    <w:rsid w:val="00FE71CD"/>
     <w:rPr>
       <w:i/>
       <w:iCs/>
@@ -935,7 +935,7 @@
     <w:basedOn w:val="Normal"/>
     <w:uiPriority w:val="34"/>
     <w:qFormat/>
-    <w:rsid w:val="00F822BF"/>
+    <w:rsid w:val="00FE71CD"/>
     <w:pPr>
       <w:ind w:left="720"/>
       <w:contextualSpacing/>
@@ -946,7 +946,7 @@
     <w:basedOn w:val="DefaultParagraphFont"/>
     <w:uiPriority w:val="21"/>
     <w:qFormat/>
-    <w:rsid w:val="00F822BF"/>
+    <w:rsid w:val="00FE71CD"/>
     <w:rPr>
       <w:i/>
       <w:iCs/>
@@ -960,7 +960,7 @@
     <w:link w:val="IntenseQuoteChar"/>
     <w:uiPriority w:val="30"/>
     <w:qFormat/>
-    <w:rsid w:val="00F822BF"/>
+    <w:rsid w:val="00FE71CD"/>
     <w:pPr>
       <w:pBdr>
         <w:top w:val="single" w:sz="4" w:space="10" w:color="0F4761" w:themeColor="accent1" w:themeShade="BF"/>
@@ -981,7 +981,7 @@
     <w:basedOn w:val="DefaultParagraphFont"/>
     <w:link w:val="IntenseQuote"/>
     <w:uiPriority w:val="30"/>
-    <w:rsid w:val="00F822BF"/>
+    <w:rsid w:val="00FE71CD"/>
     <w:rPr>
       <w:i/>
       <w:iCs/>
@@ -993,7 +993,7 @@
     <w:basedOn w:val="DefaultParagraphFont"/>
     <w:uiPriority w:val="32"/>
     <w:qFormat/>
-    <w:rsid w:val="00F822BF"/>
+    <w:rsid w:val="00FE71CD"/>
     <w:rPr>
       <w:b/>
       <w:bCs/>

</xml_diff>

<commit_message>
feat(w02e): reorder, most-recently-used Ctrl+Tab, tab menu, overflow and accessibility for tabs (#44)
Co-Authored-By: Claude Sonnet 5.5 <noreply@anthropic.com>
</commit_message>
<xml_diff>
--- a/docs/acceptance/evidence/DEMO/demo.docx
+++ b/docs/acceptance/evidence/DEMO/demo.docx
@@ -4,7 +4,7 @@
   <w:body>
     <w:p>
       <w:r>
-        <w:object w:dxaOrig="14416" w:dyaOrig="8161" w14:anchorId="619E9CF0">
+        <w:object w:dxaOrig="14416" w:dyaOrig="8161" w14:anchorId="4744277D">
           <v:shapetype id="_x0000_t75" coordsize="21600,21600" o:spt="75" o:preferrelative="t" path="m@4@5l@4@11@9@11@9@5xe" filled="f" stroked="f">
             <v:stroke joinstyle="miter"/>
             <v:formulas>
@@ -27,7 +27,7 @@
           <v:shape id="_x0000_i1028" type="#_x0000_t75" style="width:720.95pt;height:408.15pt" o:ole="">
             <v:imagedata r:id="rId4" o:title=""/>
           </v:shape>
-          <o:OLEObject Type="Embed" ProgID="Visio.Drawing.15" ShapeID="_x0000_i1028" DrawAspect="Content" ObjectID="_1853861826" r:id="rId5"/>
+          <o:OLEObject Type="Embed" ProgID="Visio.Drawing.15" ShapeID="_x0000_i1028" DrawAspect="Content" ObjectID="_1853862879" r:id="rId5"/>
         </w:object>
       </w:r>
     </w:p>
@@ -449,7 +449,7 @@
     <w:link w:val="Heading1Char"/>
     <w:uiPriority w:val="9"/>
     <w:qFormat/>
-    <w:rsid w:val="00FE71CD"/>
+    <w:rsid w:val="00A112D2"/>
     <w:pPr>
       <w:keepNext/>
       <w:keepLines/>
@@ -472,7 +472,7 @@
     <w:semiHidden/>
     <w:unhideWhenUsed/>
     <w:qFormat/>
-    <w:rsid w:val="00FE71CD"/>
+    <w:rsid w:val="00A112D2"/>
     <w:pPr>
       <w:keepNext/>
       <w:keepLines/>
@@ -495,7 +495,7 @@
     <w:semiHidden/>
     <w:unhideWhenUsed/>
     <w:qFormat/>
-    <w:rsid w:val="00FE71CD"/>
+    <w:rsid w:val="00A112D2"/>
     <w:pPr>
       <w:keepNext/>
       <w:keepLines/>
@@ -518,7 +518,7 @@
     <w:semiHidden/>
     <w:unhideWhenUsed/>
     <w:qFormat/>
-    <w:rsid w:val="00FE71CD"/>
+    <w:rsid w:val="00A112D2"/>
     <w:pPr>
       <w:keepNext/>
       <w:keepLines/>
@@ -541,7 +541,7 @@
     <w:semiHidden/>
     <w:unhideWhenUsed/>
     <w:qFormat/>
-    <w:rsid w:val="00FE71CD"/>
+    <w:rsid w:val="00A112D2"/>
     <w:pPr>
       <w:keepNext/>
       <w:keepLines/>
@@ -562,7 +562,7 @@
     <w:semiHidden/>
     <w:unhideWhenUsed/>
     <w:qFormat/>
-    <w:rsid w:val="00FE71CD"/>
+    <w:rsid w:val="00A112D2"/>
     <w:pPr>
       <w:keepNext/>
       <w:keepLines/>
@@ -585,7 +585,7 @@
     <w:semiHidden/>
     <w:unhideWhenUsed/>
     <w:qFormat/>
-    <w:rsid w:val="00FE71CD"/>
+    <w:rsid w:val="00A112D2"/>
     <w:pPr>
       <w:keepNext/>
       <w:keepLines/>
@@ -606,7 +606,7 @@
     <w:semiHidden/>
     <w:unhideWhenUsed/>
     <w:qFormat/>
-    <w:rsid w:val="00FE71CD"/>
+    <w:rsid w:val="00A112D2"/>
     <w:pPr>
       <w:keepNext/>
       <w:keepLines/>
@@ -629,7 +629,7 @@
     <w:semiHidden/>
     <w:unhideWhenUsed/>
     <w:qFormat/>
-    <w:rsid w:val="00FE71CD"/>
+    <w:rsid w:val="00A112D2"/>
     <w:pPr>
       <w:keepNext/>
       <w:keepLines/>
@@ -717,7 +717,7 @@
     <w:basedOn w:val="DefaultParagraphFont"/>
     <w:link w:val="Heading1"/>
     <w:uiPriority w:val="9"/>
-    <w:rsid w:val="00FE71CD"/>
+    <w:rsid w:val="00A112D2"/>
     <w:rPr>
       <w:rFonts w:asciiTheme="majorHAnsi" w:eastAsiaTheme="majorEastAsia" w:hAnsiTheme="majorHAnsi" w:cstheme="majorBidi"/>
       <w:color w:val="0F4761" w:themeColor="accent1" w:themeShade="BF"/>
@@ -731,7 +731,7 @@
     <w:link w:val="Heading2"/>
     <w:uiPriority w:val="9"/>
     <w:semiHidden/>
-    <w:rsid w:val="00FE71CD"/>
+    <w:rsid w:val="00A112D2"/>
     <w:rPr>
       <w:rFonts w:asciiTheme="majorHAnsi" w:eastAsiaTheme="majorEastAsia" w:hAnsiTheme="majorHAnsi" w:cstheme="majorBidi"/>
       <w:color w:val="0F4761" w:themeColor="accent1" w:themeShade="BF"/>
@@ -745,7 +745,7 @@
     <w:link w:val="Heading3"/>
     <w:uiPriority w:val="9"/>
     <w:semiHidden/>
-    <w:rsid w:val="00FE71CD"/>
+    <w:rsid w:val="00A112D2"/>
     <w:rPr>
       <w:rFonts w:eastAsiaTheme="majorEastAsia" w:cstheme="majorBidi"/>
       <w:color w:val="0F4761" w:themeColor="accent1" w:themeShade="BF"/>
@@ -759,7 +759,7 @@
     <w:link w:val="Heading4"/>
     <w:uiPriority w:val="9"/>
     <w:semiHidden/>
-    <w:rsid w:val="00FE71CD"/>
+    <w:rsid w:val="00A112D2"/>
     <w:rPr>
       <w:rFonts w:eastAsiaTheme="majorEastAsia" w:cstheme="majorBidi"/>
       <w:i/>
@@ -773,7 +773,7 @@
     <w:link w:val="Heading5"/>
     <w:uiPriority w:val="9"/>
     <w:semiHidden/>
-    <w:rsid w:val="00FE71CD"/>
+    <w:rsid w:val="00A112D2"/>
     <w:rPr>
       <w:rFonts w:eastAsiaTheme="majorEastAsia" w:cstheme="majorBidi"/>
       <w:color w:val="0F4761" w:themeColor="accent1" w:themeShade="BF"/>
@@ -785,7 +785,7 @@
     <w:link w:val="Heading6"/>
     <w:uiPriority w:val="9"/>
     <w:semiHidden/>
-    <w:rsid w:val="00FE71CD"/>
+    <w:rsid w:val="00A112D2"/>
     <w:rPr>
       <w:rFonts w:eastAsiaTheme="majorEastAsia" w:cstheme="majorBidi"/>
       <w:i/>
@@ -799,7 +799,7 @@
     <w:link w:val="Heading7"/>
     <w:uiPriority w:val="9"/>
     <w:semiHidden/>
-    <w:rsid w:val="00FE71CD"/>
+    <w:rsid w:val="00A112D2"/>
     <w:rPr>
       <w:rFonts w:eastAsiaTheme="majorEastAsia" w:cstheme="majorBidi"/>
       <w:color w:val="595959" w:themeColor="text1" w:themeTint="A6"/>
@@ -811,7 +811,7 @@
     <w:link w:val="Heading8"/>
     <w:uiPriority w:val="9"/>
     <w:semiHidden/>
-    <w:rsid w:val="00FE71CD"/>
+    <w:rsid w:val="00A112D2"/>
     <w:rPr>
       <w:rFonts w:eastAsiaTheme="majorEastAsia" w:cstheme="majorBidi"/>
       <w:i/>
@@ -825,7 +825,7 @@
     <w:link w:val="Heading9"/>
     <w:uiPriority w:val="9"/>
     <w:semiHidden/>
-    <w:rsid w:val="00FE71CD"/>
+    <w:rsid w:val="00A112D2"/>
     <w:rPr>
       <w:rFonts w:eastAsiaTheme="majorEastAsia" w:cstheme="majorBidi"/>
       <w:color w:val="272727" w:themeColor="text1" w:themeTint="D8"/>
@@ -838,7 +838,7 @@
     <w:link w:val="TitleChar"/>
     <w:uiPriority w:val="10"/>
     <w:qFormat/>
-    <w:rsid w:val="00FE71CD"/>
+    <w:rsid w:val="00A112D2"/>
     <w:pPr>
       <w:spacing w:after="80" w:line="240" w:lineRule="auto"/>
       <w:contextualSpacing/>
@@ -856,7 +856,7 @@
     <w:basedOn w:val="DefaultParagraphFont"/>
     <w:link w:val="Title"/>
     <w:uiPriority w:val="10"/>
-    <w:rsid w:val="00FE71CD"/>
+    <w:rsid w:val="00A112D2"/>
     <w:rPr>
       <w:rFonts w:asciiTheme="majorHAnsi" w:eastAsiaTheme="majorEastAsia" w:hAnsiTheme="majorHAnsi" w:cstheme="majorBidi"/>
       <w:spacing w:val="-10"/>
@@ -872,7 +872,7 @@
     <w:link w:val="SubtitleChar"/>
     <w:uiPriority w:val="11"/>
     <w:qFormat/>
-    <w:rsid w:val="00FE71CD"/>
+    <w:rsid w:val="00A112D2"/>
     <w:pPr>
       <w:numPr>
         <w:ilvl w:val="1"/>
@@ -891,7 +891,7 @@
     <w:basedOn w:val="DefaultParagraphFont"/>
     <w:link w:val="Subtitle"/>
     <w:uiPriority w:val="11"/>
-    <w:rsid w:val="00FE71CD"/>
+    <w:rsid w:val="00A112D2"/>
     <w:rPr>
       <w:rFonts w:eastAsiaTheme="majorEastAsia" w:cstheme="majorBidi"/>
       <w:color w:val="595959" w:themeColor="text1" w:themeTint="A6"/>
@@ -907,7 +907,7 @@
     <w:link w:val="QuoteChar"/>
     <w:uiPriority w:val="29"/>
     <w:qFormat/>
-    <w:rsid w:val="00FE71CD"/>
+    <w:rsid w:val="00A112D2"/>
     <w:pPr>
       <w:spacing w:before="160"/>
       <w:jc w:val="center"/>
@@ -923,7 +923,7 @@
     <w:basedOn w:val="DefaultParagraphFont"/>
     <w:link w:val="Quote"/>
     <w:uiPriority w:val="29"/>
-    <w:rsid w:val="00FE71CD"/>
+    <w:rsid w:val="00A112D2"/>
     <w:rPr>
       <w:i/>
       <w:iCs/>
@@ -935,7 +935,7 @@
     <w:basedOn w:val="Normal"/>
     <w:uiPriority w:val="34"/>
     <w:qFormat/>
-    <w:rsid w:val="00FE71CD"/>
+    <w:rsid w:val="00A112D2"/>
     <w:pPr>
       <w:ind w:left="720"/>
       <w:contextualSpacing/>
@@ -946,7 +946,7 @@
     <w:basedOn w:val="DefaultParagraphFont"/>
     <w:uiPriority w:val="21"/>
     <w:qFormat/>
-    <w:rsid w:val="00FE71CD"/>
+    <w:rsid w:val="00A112D2"/>
     <w:rPr>
       <w:i/>
       <w:iCs/>
@@ -960,7 +960,7 @@
     <w:link w:val="IntenseQuoteChar"/>
     <w:uiPriority w:val="30"/>
     <w:qFormat/>
-    <w:rsid w:val="00FE71CD"/>
+    <w:rsid w:val="00A112D2"/>
     <w:pPr>
       <w:pBdr>
         <w:top w:val="single" w:sz="4" w:space="10" w:color="0F4761" w:themeColor="accent1" w:themeShade="BF"/>
@@ -981,7 +981,7 @@
     <w:basedOn w:val="DefaultParagraphFont"/>
     <w:link w:val="IntenseQuote"/>
     <w:uiPriority w:val="30"/>
-    <w:rsid w:val="00FE71CD"/>
+    <w:rsid w:val="00A112D2"/>
     <w:rPr>
       <w:i/>
       <w:iCs/>
@@ -993,7 +993,7 @@
     <w:basedOn w:val="DefaultParagraphFont"/>
     <w:uiPriority w:val="32"/>
     <w:qFormat/>
-    <w:rsid w:val="00FE71CD"/>
+    <w:rsid w:val="00A112D2"/>
     <w:rPr>
       <w:b/>
       <w:bCs/>

</xml_diff>

<commit_message>
feat(r09): swimlane layout component, lane membership in the summary, lane-aware inspection (#4)
Co-Authored-By: Claude Sonnet 5.5 <noreply@anthropic.com>
</commit_message>
<xml_diff>
--- a/docs/acceptance/evidence/DEMO/demo.docx
+++ b/docs/acceptance/evidence/DEMO/demo.docx
@@ -4,7 +4,7 @@
   <w:body>
     <w:p>
       <w:r>
-        <w:object w:dxaOrig="14416" w:dyaOrig="8161" w14:anchorId="4744277D">
+        <w:object w:dxaOrig="14416" w:dyaOrig="8161" w14:anchorId="520505D2">
           <v:shapetype id="_x0000_t75" coordsize="21600,21600" o:spt="75" o:preferrelative="t" path="m@4@5l@4@11@9@11@9@5xe" filled="f" stroked="f">
             <v:stroke joinstyle="miter"/>
             <v:formulas>
@@ -27,7 +27,7 @@
           <v:shape id="_x0000_i1028" type="#_x0000_t75" style="width:720.95pt;height:408.15pt" o:ole="">
             <v:imagedata r:id="rId4" o:title=""/>
           </v:shape>
-          <o:OLEObject Type="Embed" ProgID="Visio.Drawing.15" ShapeID="_x0000_i1028" DrawAspect="Content" ObjectID="_1853862879" r:id="rId5"/>
+          <o:OLEObject Type="Embed" ProgID="Visio.Drawing.15" ShapeID="_x0000_i1028" DrawAspect="Content" ObjectID="_1853864974" r:id="rId5"/>
         </w:object>
       </w:r>
     </w:p>
@@ -449,7 +449,7 @@
     <w:link w:val="Heading1Char"/>
     <w:uiPriority w:val="9"/>
     <w:qFormat/>
-    <w:rsid w:val="00A112D2"/>
+    <w:rsid w:val="00F211BA"/>
     <w:pPr>
       <w:keepNext/>
       <w:keepLines/>
@@ -472,7 +472,7 @@
     <w:semiHidden/>
     <w:unhideWhenUsed/>
     <w:qFormat/>
-    <w:rsid w:val="00A112D2"/>
+    <w:rsid w:val="00F211BA"/>
     <w:pPr>
       <w:keepNext/>
       <w:keepLines/>
@@ -495,7 +495,7 @@
     <w:semiHidden/>
     <w:unhideWhenUsed/>
     <w:qFormat/>
-    <w:rsid w:val="00A112D2"/>
+    <w:rsid w:val="00F211BA"/>
     <w:pPr>
       <w:keepNext/>
       <w:keepLines/>
@@ -518,7 +518,7 @@
     <w:semiHidden/>
     <w:unhideWhenUsed/>
     <w:qFormat/>
-    <w:rsid w:val="00A112D2"/>
+    <w:rsid w:val="00F211BA"/>
     <w:pPr>
       <w:keepNext/>
       <w:keepLines/>
@@ -541,7 +541,7 @@
     <w:semiHidden/>
     <w:unhideWhenUsed/>
     <w:qFormat/>
-    <w:rsid w:val="00A112D2"/>
+    <w:rsid w:val="00F211BA"/>
     <w:pPr>
       <w:keepNext/>
       <w:keepLines/>
@@ -562,7 +562,7 @@
     <w:semiHidden/>
     <w:unhideWhenUsed/>
     <w:qFormat/>
-    <w:rsid w:val="00A112D2"/>
+    <w:rsid w:val="00F211BA"/>
     <w:pPr>
       <w:keepNext/>
       <w:keepLines/>
@@ -585,7 +585,7 @@
     <w:semiHidden/>
     <w:unhideWhenUsed/>
     <w:qFormat/>
-    <w:rsid w:val="00A112D2"/>
+    <w:rsid w:val="00F211BA"/>
     <w:pPr>
       <w:keepNext/>
       <w:keepLines/>
@@ -606,7 +606,7 @@
     <w:semiHidden/>
     <w:unhideWhenUsed/>
     <w:qFormat/>
-    <w:rsid w:val="00A112D2"/>
+    <w:rsid w:val="00F211BA"/>
     <w:pPr>
       <w:keepNext/>
       <w:keepLines/>
@@ -629,7 +629,7 @@
     <w:semiHidden/>
     <w:unhideWhenUsed/>
     <w:qFormat/>
-    <w:rsid w:val="00A112D2"/>
+    <w:rsid w:val="00F211BA"/>
     <w:pPr>
       <w:keepNext/>
       <w:keepLines/>
@@ -717,7 +717,7 @@
     <w:basedOn w:val="DefaultParagraphFont"/>
     <w:link w:val="Heading1"/>
     <w:uiPriority w:val="9"/>
-    <w:rsid w:val="00A112D2"/>
+    <w:rsid w:val="00F211BA"/>
     <w:rPr>
       <w:rFonts w:asciiTheme="majorHAnsi" w:eastAsiaTheme="majorEastAsia" w:hAnsiTheme="majorHAnsi" w:cstheme="majorBidi"/>
       <w:color w:val="0F4761" w:themeColor="accent1" w:themeShade="BF"/>
@@ -731,7 +731,7 @@
     <w:link w:val="Heading2"/>
     <w:uiPriority w:val="9"/>
     <w:semiHidden/>
-    <w:rsid w:val="00A112D2"/>
+    <w:rsid w:val="00F211BA"/>
     <w:rPr>
       <w:rFonts w:asciiTheme="majorHAnsi" w:eastAsiaTheme="majorEastAsia" w:hAnsiTheme="majorHAnsi" w:cstheme="majorBidi"/>
       <w:color w:val="0F4761" w:themeColor="accent1" w:themeShade="BF"/>
@@ -745,7 +745,7 @@
     <w:link w:val="Heading3"/>
     <w:uiPriority w:val="9"/>
     <w:semiHidden/>
-    <w:rsid w:val="00A112D2"/>
+    <w:rsid w:val="00F211BA"/>
     <w:rPr>
       <w:rFonts w:eastAsiaTheme="majorEastAsia" w:cstheme="majorBidi"/>
       <w:color w:val="0F4761" w:themeColor="accent1" w:themeShade="BF"/>
@@ -759,7 +759,7 @@
     <w:link w:val="Heading4"/>
     <w:uiPriority w:val="9"/>
     <w:semiHidden/>
-    <w:rsid w:val="00A112D2"/>
+    <w:rsid w:val="00F211BA"/>
     <w:rPr>
       <w:rFonts w:eastAsiaTheme="majorEastAsia" w:cstheme="majorBidi"/>
       <w:i/>
@@ -773,7 +773,7 @@
     <w:link w:val="Heading5"/>
     <w:uiPriority w:val="9"/>
     <w:semiHidden/>
-    <w:rsid w:val="00A112D2"/>
+    <w:rsid w:val="00F211BA"/>
     <w:rPr>
       <w:rFonts w:eastAsiaTheme="majorEastAsia" w:cstheme="majorBidi"/>
       <w:color w:val="0F4761" w:themeColor="accent1" w:themeShade="BF"/>
@@ -785,7 +785,7 @@
     <w:link w:val="Heading6"/>
     <w:uiPriority w:val="9"/>
     <w:semiHidden/>
-    <w:rsid w:val="00A112D2"/>
+    <w:rsid w:val="00F211BA"/>
     <w:rPr>
       <w:rFonts w:eastAsiaTheme="majorEastAsia" w:cstheme="majorBidi"/>
       <w:i/>
@@ -799,7 +799,7 @@
     <w:link w:val="Heading7"/>
     <w:uiPriority w:val="9"/>
     <w:semiHidden/>
-    <w:rsid w:val="00A112D2"/>
+    <w:rsid w:val="00F211BA"/>
     <w:rPr>
       <w:rFonts w:eastAsiaTheme="majorEastAsia" w:cstheme="majorBidi"/>
       <w:color w:val="595959" w:themeColor="text1" w:themeTint="A6"/>
@@ -811,7 +811,7 @@
     <w:link w:val="Heading8"/>
     <w:uiPriority w:val="9"/>
     <w:semiHidden/>
-    <w:rsid w:val="00A112D2"/>
+    <w:rsid w:val="00F211BA"/>
     <w:rPr>
       <w:rFonts w:eastAsiaTheme="majorEastAsia" w:cstheme="majorBidi"/>
       <w:i/>
@@ -825,7 +825,7 @@
     <w:link w:val="Heading9"/>
     <w:uiPriority w:val="9"/>
     <w:semiHidden/>
-    <w:rsid w:val="00A112D2"/>
+    <w:rsid w:val="00F211BA"/>
     <w:rPr>
       <w:rFonts w:eastAsiaTheme="majorEastAsia" w:cstheme="majorBidi"/>
       <w:color w:val="272727" w:themeColor="text1" w:themeTint="D8"/>
@@ -838,7 +838,7 @@
     <w:link w:val="TitleChar"/>
     <w:uiPriority w:val="10"/>
     <w:qFormat/>
-    <w:rsid w:val="00A112D2"/>
+    <w:rsid w:val="00F211BA"/>
     <w:pPr>
       <w:spacing w:after="80" w:line="240" w:lineRule="auto"/>
       <w:contextualSpacing/>
@@ -856,7 +856,7 @@
     <w:basedOn w:val="DefaultParagraphFont"/>
     <w:link w:val="Title"/>
     <w:uiPriority w:val="10"/>
-    <w:rsid w:val="00A112D2"/>
+    <w:rsid w:val="00F211BA"/>
     <w:rPr>
       <w:rFonts w:asciiTheme="majorHAnsi" w:eastAsiaTheme="majorEastAsia" w:hAnsiTheme="majorHAnsi" w:cstheme="majorBidi"/>
       <w:spacing w:val="-10"/>
@@ -872,7 +872,7 @@
     <w:link w:val="SubtitleChar"/>
     <w:uiPriority w:val="11"/>
     <w:qFormat/>
-    <w:rsid w:val="00A112D2"/>
+    <w:rsid w:val="00F211BA"/>
     <w:pPr>
       <w:numPr>
         <w:ilvl w:val="1"/>
@@ -891,7 +891,7 @@
     <w:basedOn w:val="DefaultParagraphFont"/>
     <w:link w:val="Subtitle"/>
     <w:uiPriority w:val="11"/>
-    <w:rsid w:val="00A112D2"/>
+    <w:rsid w:val="00F211BA"/>
     <w:rPr>
       <w:rFonts w:eastAsiaTheme="majorEastAsia" w:cstheme="majorBidi"/>
       <w:color w:val="595959" w:themeColor="text1" w:themeTint="A6"/>
@@ -907,7 +907,7 @@
     <w:link w:val="QuoteChar"/>
     <w:uiPriority w:val="29"/>
     <w:qFormat/>
-    <w:rsid w:val="00A112D2"/>
+    <w:rsid w:val="00F211BA"/>
     <w:pPr>
       <w:spacing w:before="160"/>
       <w:jc w:val="center"/>
@@ -923,7 +923,7 @@
     <w:basedOn w:val="DefaultParagraphFont"/>
     <w:link w:val="Quote"/>
     <w:uiPriority w:val="29"/>
-    <w:rsid w:val="00A112D2"/>
+    <w:rsid w:val="00F211BA"/>
     <w:rPr>
       <w:i/>
       <w:iCs/>
@@ -935,7 +935,7 @@
     <w:basedOn w:val="Normal"/>
     <w:uiPriority w:val="34"/>
     <w:qFormat/>
-    <w:rsid w:val="00A112D2"/>
+    <w:rsid w:val="00F211BA"/>
     <w:pPr>
       <w:ind w:left="720"/>
       <w:contextualSpacing/>
@@ -946,7 +946,7 @@
     <w:basedOn w:val="DefaultParagraphFont"/>
     <w:uiPriority w:val="21"/>
     <w:qFormat/>
-    <w:rsid w:val="00A112D2"/>
+    <w:rsid w:val="00F211BA"/>
     <w:rPr>
       <w:i/>
       <w:iCs/>
@@ -960,7 +960,7 @@
     <w:link w:val="IntenseQuoteChar"/>
     <w:uiPriority w:val="30"/>
     <w:qFormat/>
-    <w:rsid w:val="00A112D2"/>
+    <w:rsid w:val="00F211BA"/>
     <w:pPr>
       <w:pBdr>
         <w:top w:val="single" w:sz="4" w:space="10" w:color="0F4761" w:themeColor="accent1" w:themeShade="BF"/>
@@ -981,7 +981,7 @@
     <w:basedOn w:val="DefaultParagraphFont"/>
     <w:link w:val="IntenseQuote"/>
     <w:uiPriority w:val="30"/>
-    <w:rsid w:val="00A112D2"/>
+    <w:rsid w:val="00F211BA"/>
     <w:rPr>
       <w:i/>
       <w:iCs/>
@@ -993,7 +993,7 @@
     <w:basedOn w:val="DefaultParagraphFont"/>
     <w:uiPriority w:val="32"/>
     <w:qFormat/>
-    <w:rsid w:val="00A112D2"/>
+    <w:rsid w:val="00F211BA"/>
     <w:rPr>
       <w:b/>
       <w:bCs/>

</xml_diff>

<commit_message>
feat(r10): flowchart symbols with arc outlines, native Visio ArcTo geometry and ports (#5)
Co-Authored-By: Claude Sonnet 5.5 <noreply@anthropic.com>
</commit_message>
<xml_diff>
--- a/docs/acceptance/evidence/DEMO/demo.docx
+++ b/docs/acceptance/evidence/DEMO/demo.docx
@@ -4,7 +4,7 @@
   <w:body>
     <w:p>
       <w:r>
-        <w:object w:dxaOrig="14416" w:dyaOrig="8161" w14:anchorId="520505D2">
+        <w:object w:dxaOrig="14416" w:dyaOrig="8161" w14:anchorId="3A2D8FEC">
           <v:shapetype id="_x0000_t75" coordsize="21600,21600" o:spt="75" o:preferrelative="t" path="m@4@5l@4@11@9@11@9@5xe" filled="f" stroked="f">
             <v:stroke joinstyle="miter"/>
             <v:formulas>
@@ -27,7 +27,7 @@
           <v:shape id="_x0000_i1028" type="#_x0000_t75" style="width:720.95pt;height:408.15pt" o:ole="">
             <v:imagedata r:id="rId4" o:title=""/>
           </v:shape>
-          <o:OLEObject Type="Embed" ProgID="Visio.Drawing.15" ShapeID="_x0000_i1028" DrawAspect="Content" ObjectID="_1853864974" r:id="rId5"/>
+          <o:OLEObject Type="Embed" ProgID="Visio.Drawing.15" ShapeID="_x0000_i1028" DrawAspect="Content" ObjectID="_1853868202" r:id="rId5"/>
         </w:object>
       </w:r>
     </w:p>
@@ -449,7 +449,7 @@
     <w:link w:val="Heading1Char"/>
     <w:uiPriority w:val="9"/>
     <w:qFormat/>
-    <w:rsid w:val="00F211BA"/>
+    <w:rsid w:val="000C4162"/>
     <w:pPr>
       <w:keepNext/>
       <w:keepLines/>
@@ -472,7 +472,7 @@
     <w:semiHidden/>
     <w:unhideWhenUsed/>
     <w:qFormat/>
-    <w:rsid w:val="00F211BA"/>
+    <w:rsid w:val="000C4162"/>
     <w:pPr>
       <w:keepNext/>
       <w:keepLines/>
@@ -495,7 +495,7 @@
     <w:semiHidden/>
     <w:unhideWhenUsed/>
     <w:qFormat/>
-    <w:rsid w:val="00F211BA"/>
+    <w:rsid w:val="000C4162"/>
     <w:pPr>
       <w:keepNext/>
       <w:keepLines/>
@@ -518,7 +518,7 @@
     <w:semiHidden/>
     <w:unhideWhenUsed/>
     <w:qFormat/>
-    <w:rsid w:val="00F211BA"/>
+    <w:rsid w:val="000C4162"/>
     <w:pPr>
       <w:keepNext/>
       <w:keepLines/>
@@ -541,7 +541,7 @@
     <w:semiHidden/>
     <w:unhideWhenUsed/>
     <w:qFormat/>
-    <w:rsid w:val="00F211BA"/>
+    <w:rsid w:val="000C4162"/>
     <w:pPr>
       <w:keepNext/>
       <w:keepLines/>
@@ -562,7 +562,7 @@
     <w:semiHidden/>
     <w:unhideWhenUsed/>
     <w:qFormat/>
-    <w:rsid w:val="00F211BA"/>
+    <w:rsid w:val="000C4162"/>
     <w:pPr>
       <w:keepNext/>
       <w:keepLines/>
@@ -585,7 +585,7 @@
     <w:semiHidden/>
     <w:unhideWhenUsed/>
     <w:qFormat/>
-    <w:rsid w:val="00F211BA"/>
+    <w:rsid w:val="000C4162"/>
     <w:pPr>
       <w:keepNext/>
       <w:keepLines/>
@@ -606,7 +606,7 @@
     <w:semiHidden/>
     <w:unhideWhenUsed/>
     <w:qFormat/>
-    <w:rsid w:val="00F211BA"/>
+    <w:rsid w:val="000C4162"/>
     <w:pPr>
       <w:keepNext/>
       <w:keepLines/>
@@ -629,7 +629,7 @@
     <w:semiHidden/>
     <w:unhideWhenUsed/>
     <w:qFormat/>
-    <w:rsid w:val="00F211BA"/>
+    <w:rsid w:val="000C4162"/>
     <w:pPr>
       <w:keepNext/>
       <w:keepLines/>
@@ -717,7 +717,7 @@
     <w:basedOn w:val="DefaultParagraphFont"/>
     <w:link w:val="Heading1"/>
     <w:uiPriority w:val="9"/>
-    <w:rsid w:val="00F211BA"/>
+    <w:rsid w:val="000C4162"/>
     <w:rPr>
       <w:rFonts w:asciiTheme="majorHAnsi" w:eastAsiaTheme="majorEastAsia" w:hAnsiTheme="majorHAnsi" w:cstheme="majorBidi"/>
       <w:color w:val="0F4761" w:themeColor="accent1" w:themeShade="BF"/>
@@ -731,7 +731,7 @@
     <w:link w:val="Heading2"/>
     <w:uiPriority w:val="9"/>
     <w:semiHidden/>
-    <w:rsid w:val="00F211BA"/>
+    <w:rsid w:val="000C4162"/>
     <w:rPr>
       <w:rFonts w:asciiTheme="majorHAnsi" w:eastAsiaTheme="majorEastAsia" w:hAnsiTheme="majorHAnsi" w:cstheme="majorBidi"/>
       <w:color w:val="0F4761" w:themeColor="accent1" w:themeShade="BF"/>
@@ -745,7 +745,7 @@
     <w:link w:val="Heading3"/>
     <w:uiPriority w:val="9"/>
     <w:semiHidden/>
-    <w:rsid w:val="00F211BA"/>
+    <w:rsid w:val="000C4162"/>
     <w:rPr>
       <w:rFonts w:eastAsiaTheme="majorEastAsia" w:cstheme="majorBidi"/>
       <w:color w:val="0F4761" w:themeColor="accent1" w:themeShade="BF"/>
@@ -759,7 +759,7 @@
     <w:link w:val="Heading4"/>
     <w:uiPriority w:val="9"/>
     <w:semiHidden/>
-    <w:rsid w:val="00F211BA"/>
+    <w:rsid w:val="000C4162"/>
     <w:rPr>
       <w:rFonts w:eastAsiaTheme="majorEastAsia" w:cstheme="majorBidi"/>
       <w:i/>
@@ -773,7 +773,7 @@
     <w:link w:val="Heading5"/>
     <w:uiPriority w:val="9"/>
     <w:semiHidden/>
-    <w:rsid w:val="00F211BA"/>
+    <w:rsid w:val="000C4162"/>
     <w:rPr>
       <w:rFonts w:eastAsiaTheme="majorEastAsia" w:cstheme="majorBidi"/>
       <w:color w:val="0F4761" w:themeColor="accent1" w:themeShade="BF"/>
@@ -785,7 +785,7 @@
     <w:link w:val="Heading6"/>
     <w:uiPriority w:val="9"/>
     <w:semiHidden/>
-    <w:rsid w:val="00F211BA"/>
+    <w:rsid w:val="000C4162"/>
     <w:rPr>
       <w:rFonts w:eastAsiaTheme="majorEastAsia" w:cstheme="majorBidi"/>
       <w:i/>
@@ -799,7 +799,7 @@
     <w:link w:val="Heading7"/>
     <w:uiPriority w:val="9"/>
     <w:semiHidden/>
-    <w:rsid w:val="00F211BA"/>
+    <w:rsid w:val="000C4162"/>
     <w:rPr>
       <w:rFonts w:eastAsiaTheme="majorEastAsia" w:cstheme="majorBidi"/>
       <w:color w:val="595959" w:themeColor="text1" w:themeTint="A6"/>
@@ -811,7 +811,7 @@
     <w:link w:val="Heading8"/>
     <w:uiPriority w:val="9"/>
     <w:semiHidden/>
-    <w:rsid w:val="00F211BA"/>
+    <w:rsid w:val="000C4162"/>
     <w:rPr>
       <w:rFonts w:eastAsiaTheme="majorEastAsia" w:cstheme="majorBidi"/>
       <w:i/>
@@ -825,7 +825,7 @@
     <w:link w:val="Heading9"/>
     <w:uiPriority w:val="9"/>
     <w:semiHidden/>
-    <w:rsid w:val="00F211BA"/>
+    <w:rsid w:val="000C4162"/>
     <w:rPr>
       <w:rFonts w:eastAsiaTheme="majorEastAsia" w:cstheme="majorBidi"/>
       <w:color w:val="272727" w:themeColor="text1" w:themeTint="D8"/>
@@ -838,7 +838,7 @@
     <w:link w:val="TitleChar"/>
     <w:uiPriority w:val="10"/>
     <w:qFormat/>
-    <w:rsid w:val="00F211BA"/>
+    <w:rsid w:val="000C4162"/>
     <w:pPr>
       <w:spacing w:after="80" w:line="240" w:lineRule="auto"/>
       <w:contextualSpacing/>
@@ -856,7 +856,7 @@
     <w:basedOn w:val="DefaultParagraphFont"/>
     <w:link w:val="Title"/>
     <w:uiPriority w:val="10"/>
-    <w:rsid w:val="00F211BA"/>
+    <w:rsid w:val="000C4162"/>
     <w:rPr>
       <w:rFonts w:asciiTheme="majorHAnsi" w:eastAsiaTheme="majorEastAsia" w:hAnsiTheme="majorHAnsi" w:cstheme="majorBidi"/>
       <w:spacing w:val="-10"/>
@@ -872,7 +872,7 @@
     <w:link w:val="SubtitleChar"/>
     <w:uiPriority w:val="11"/>
     <w:qFormat/>
-    <w:rsid w:val="00F211BA"/>
+    <w:rsid w:val="000C4162"/>
     <w:pPr>
       <w:numPr>
         <w:ilvl w:val="1"/>
@@ -891,7 +891,7 @@
     <w:basedOn w:val="DefaultParagraphFont"/>
     <w:link w:val="Subtitle"/>
     <w:uiPriority w:val="11"/>
-    <w:rsid w:val="00F211BA"/>
+    <w:rsid w:val="000C4162"/>
     <w:rPr>
       <w:rFonts w:eastAsiaTheme="majorEastAsia" w:cstheme="majorBidi"/>
       <w:color w:val="595959" w:themeColor="text1" w:themeTint="A6"/>
@@ -907,7 +907,7 @@
     <w:link w:val="QuoteChar"/>
     <w:uiPriority w:val="29"/>
     <w:qFormat/>
-    <w:rsid w:val="00F211BA"/>
+    <w:rsid w:val="000C4162"/>
     <w:pPr>
       <w:spacing w:before="160"/>
       <w:jc w:val="center"/>
@@ -923,7 +923,7 @@
     <w:basedOn w:val="DefaultParagraphFont"/>
     <w:link w:val="Quote"/>
     <w:uiPriority w:val="29"/>
-    <w:rsid w:val="00F211BA"/>
+    <w:rsid w:val="000C4162"/>
     <w:rPr>
       <w:i/>
       <w:iCs/>
@@ -935,7 +935,7 @@
     <w:basedOn w:val="Normal"/>
     <w:uiPriority w:val="34"/>
     <w:qFormat/>
-    <w:rsid w:val="00F211BA"/>
+    <w:rsid w:val="000C4162"/>
     <w:pPr>
       <w:ind w:left="720"/>
       <w:contextualSpacing/>
@@ -946,7 +946,7 @@
     <w:basedOn w:val="DefaultParagraphFont"/>
     <w:uiPriority w:val="21"/>
     <w:qFormat/>
-    <w:rsid w:val="00F211BA"/>
+    <w:rsid w:val="000C4162"/>
     <w:rPr>
       <w:i/>
       <w:iCs/>
@@ -960,7 +960,7 @@
     <w:link w:val="IntenseQuoteChar"/>
     <w:uiPriority w:val="30"/>
     <w:qFormat/>
-    <w:rsid w:val="00F211BA"/>
+    <w:rsid w:val="000C4162"/>
     <w:pPr>
       <w:pBdr>
         <w:top w:val="single" w:sz="4" w:space="10" w:color="0F4761" w:themeColor="accent1" w:themeShade="BF"/>
@@ -981,7 +981,7 @@
     <w:basedOn w:val="DefaultParagraphFont"/>
     <w:link w:val="IntenseQuote"/>
     <w:uiPriority w:val="30"/>
-    <w:rsid w:val="00F211BA"/>
+    <w:rsid w:val="000C4162"/>
     <w:rPr>
       <w:i/>
       <w:iCs/>
@@ -993,7 +993,7 @@
     <w:basedOn w:val="DefaultParagraphFont"/>
     <w:uiPriority w:val="32"/>
     <w:qFormat/>
-    <w:rsid w:val="00F211BA"/>
+    <w:rsid w:val="000C4162"/>
     <w:rPr>
       <w:b/>
       <w:bCs/>

</xml_diff>

<commit_message>
feat(r11): linear gradient fills in the editor, renders, Visio export and import (#6)
Co-Authored-By: Claude Sonnet 5.5 <noreply@anthropic.com>
</commit_message>
<xml_diff>
--- a/docs/acceptance/evidence/DEMO/demo.docx
+++ b/docs/acceptance/evidence/DEMO/demo.docx
@@ -4,7 +4,7 @@
   <w:body>
     <w:p>
       <w:r>
-        <w:object w:dxaOrig="14416" w:dyaOrig="8161" w14:anchorId="3A2D8FEC">
+        <w:object w:dxaOrig="14416" w:dyaOrig="8161" w14:anchorId="3AB73EE2">
           <v:shapetype id="_x0000_t75" coordsize="21600,21600" o:spt="75" o:preferrelative="t" path="m@4@5l@4@11@9@11@9@5xe" filled="f" stroked="f">
             <v:stroke joinstyle="miter"/>
             <v:formulas>
@@ -27,7 +27,7 @@
           <v:shape id="_x0000_i1028" type="#_x0000_t75" style="width:720.95pt;height:408.15pt" o:ole="">
             <v:imagedata r:id="rId4" o:title=""/>
           </v:shape>
-          <o:OLEObject Type="Embed" ProgID="Visio.Drawing.15" ShapeID="_x0000_i1028" DrawAspect="Content" ObjectID="_1853868202" r:id="rId5"/>
+          <o:OLEObject Type="Embed" ProgID="Visio.Drawing.15" ShapeID="_x0000_i1028" DrawAspect="Content" ObjectID="_1853870448" r:id="rId5"/>
         </w:object>
       </w:r>
     </w:p>
@@ -449,7 +449,7 @@
     <w:link w:val="Heading1Char"/>
     <w:uiPriority w:val="9"/>
     <w:qFormat/>
-    <w:rsid w:val="000C4162"/>
+    <w:rsid w:val="009D7A2D"/>
     <w:pPr>
       <w:keepNext/>
       <w:keepLines/>
@@ -472,7 +472,7 @@
     <w:semiHidden/>
     <w:unhideWhenUsed/>
     <w:qFormat/>
-    <w:rsid w:val="000C4162"/>
+    <w:rsid w:val="009D7A2D"/>
     <w:pPr>
       <w:keepNext/>
       <w:keepLines/>
@@ -495,7 +495,7 @@
     <w:semiHidden/>
     <w:unhideWhenUsed/>
     <w:qFormat/>
-    <w:rsid w:val="000C4162"/>
+    <w:rsid w:val="009D7A2D"/>
     <w:pPr>
       <w:keepNext/>
       <w:keepLines/>
@@ -518,7 +518,7 @@
     <w:semiHidden/>
     <w:unhideWhenUsed/>
     <w:qFormat/>
-    <w:rsid w:val="000C4162"/>
+    <w:rsid w:val="009D7A2D"/>
     <w:pPr>
       <w:keepNext/>
       <w:keepLines/>
@@ -541,7 +541,7 @@
     <w:semiHidden/>
     <w:unhideWhenUsed/>
     <w:qFormat/>
-    <w:rsid w:val="000C4162"/>
+    <w:rsid w:val="009D7A2D"/>
     <w:pPr>
       <w:keepNext/>
       <w:keepLines/>
@@ -562,7 +562,7 @@
     <w:semiHidden/>
     <w:unhideWhenUsed/>
     <w:qFormat/>
-    <w:rsid w:val="000C4162"/>
+    <w:rsid w:val="009D7A2D"/>
     <w:pPr>
       <w:keepNext/>
       <w:keepLines/>
@@ -585,7 +585,7 @@
     <w:semiHidden/>
     <w:unhideWhenUsed/>
     <w:qFormat/>
-    <w:rsid w:val="000C4162"/>
+    <w:rsid w:val="009D7A2D"/>
     <w:pPr>
       <w:keepNext/>
       <w:keepLines/>
@@ -606,7 +606,7 @@
     <w:semiHidden/>
     <w:unhideWhenUsed/>
     <w:qFormat/>
-    <w:rsid w:val="000C4162"/>
+    <w:rsid w:val="009D7A2D"/>
     <w:pPr>
       <w:keepNext/>
       <w:keepLines/>
@@ -629,7 +629,7 @@
     <w:semiHidden/>
     <w:unhideWhenUsed/>
     <w:qFormat/>
-    <w:rsid w:val="000C4162"/>
+    <w:rsid w:val="009D7A2D"/>
     <w:pPr>
       <w:keepNext/>
       <w:keepLines/>
@@ -717,7 +717,7 @@
     <w:basedOn w:val="DefaultParagraphFont"/>
     <w:link w:val="Heading1"/>
     <w:uiPriority w:val="9"/>
-    <w:rsid w:val="000C4162"/>
+    <w:rsid w:val="009D7A2D"/>
     <w:rPr>
       <w:rFonts w:asciiTheme="majorHAnsi" w:eastAsiaTheme="majorEastAsia" w:hAnsiTheme="majorHAnsi" w:cstheme="majorBidi"/>
       <w:color w:val="0F4761" w:themeColor="accent1" w:themeShade="BF"/>
@@ -731,7 +731,7 @@
     <w:link w:val="Heading2"/>
     <w:uiPriority w:val="9"/>
     <w:semiHidden/>
-    <w:rsid w:val="000C4162"/>
+    <w:rsid w:val="009D7A2D"/>
     <w:rPr>
       <w:rFonts w:asciiTheme="majorHAnsi" w:eastAsiaTheme="majorEastAsia" w:hAnsiTheme="majorHAnsi" w:cstheme="majorBidi"/>
       <w:color w:val="0F4761" w:themeColor="accent1" w:themeShade="BF"/>
@@ -745,7 +745,7 @@
     <w:link w:val="Heading3"/>
     <w:uiPriority w:val="9"/>
     <w:semiHidden/>
-    <w:rsid w:val="000C4162"/>
+    <w:rsid w:val="009D7A2D"/>
     <w:rPr>
       <w:rFonts w:eastAsiaTheme="majorEastAsia" w:cstheme="majorBidi"/>
       <w:color w:val="0F4761" w:themeColor="accent1" w:themeShade="BF"/>
@@ -759,7 +759,7 @@
     <w:link w:val="Heading4"/>
     <w:uiPriority w:val="9"/>
     <w:semiHidden/>
-    <w:rsid w:val="000C4162"/>
+    <w:rsid w:val="009D7A2D"/>
     <w:rPr>
       <w:rFonts w:eastAsiaTheme="majorEastAsia" w:cstheme="majorBidi"/>
       <w:i/>
@@ -773,7 +773,7 @@
     <w:link w:val="Heading5"/>
     <w:uiPriority w:val="9"/>
     <w:semiHidden/>
-    <w:rsid w:val="000C4162"/>
+    <w:rsid w:val="009D7A2D"/>
     <w:rPr>
       <w:rFonts w:eastAsiaTheme="majorEastAsia" w:cstheme="majorBidi"/>
       <w:color w:val="0F4761" w:themeColor="accent1" w:themeShade="BF"/>
@@ -785,7 +785,7 @@
     <w:link w:val="Heading6"/>
     <w:uiPriority w:val="9"/>
     <w:semiHidden/>
-    <w:rsid w:val="000C4162"/>
+    <w:rsid w:val="009D7A2D"/>
     <w:rPr>
       <w:rFonts w:eastAsiaTheme="majorEastAsia" w:cstheme="majorBidi"/>
       <w:i/>
@@ -799,7 +799,7 @@
     <w:link w:val="Heading7"/>
     <w:uiPriority w:val="9"/>
     <w:semiHidden/>
-    <w:rsid w:val="000C4162"/>
+    <w:rsid w:val="009D7A2D"/>
     <w:rPr>
       <w:rFonts w:eastAsiaTheme="majorEastAsia" w:cstheme="majorBidi"/>
       <w:color w:val="595959" w:themeColor="text1" w:themeTint="A6"/>
@@ -811,7 +811,7 @@
     <w:link w:val="Heading8"/>
     <w:uiPriority w:val="9"/>
     <w:semiHidden/>
-    <w:rsid w:val="000C4162"/>
+    <w:rsid w:val="009D7A2D"/>
     <w:rPr>
       <w:rFonts w:eastAsiaTheme="majorEastAsia" w:cstheme="majorBidi"/>
       <w:i/>
@@ -825,7 +825,7 @@
     <w:link w:val="Heading9"/>
     <w:uiPriority w:val="9"/>
     <w:semiHidden/>
-    <w:rsid w:val="000C4162"/>
+    <w:rsid w:val="009D7A2D"/>
     <w:rPr>
       <w:rFonts w:eastAsiaTheme="majorEastAsia" w:cstheme="majorBidi"/>
       <w:color w:val="272727" w:themeColor="text1" w:themeTint="D8"/>
@@ -838,7 +838,7 @@
     <w:link w:val="TitleChar"/>
     <w:uiPriority w:val="10"/>
     <w:qFormat/>
-    <w:rsid w:val="000C4162"/>
+    <w:rsid w:val="009D7A2D"/>
     <w:pPr>
       <w:spacing w:after="80" w:line="240" w:lineRule="auto"/>
       <w:contextualSpacing/>
@@ -856,7 +856,7 @@
     <w:basedOn w:val="DefaultParagraphFont"/>
     <w:link w:val="Title"/>
     <w:uiPriority w:val="10"/>
-    <w:rsid w:val="000C4162"/>
+    <w:rsid w:val="009D7A2D"/>
     <w:rPr>
       <w:rFonts w:asciiTheme="majorHAnsi" w:eastAsiaTheme="majorEastAsia" w:hAnsiTheme="majorHAnsi" w:cstheme="majorBidi"/>
       <w:spacing w:val="-10"/>
@@ -872,7 +872,7 @@
     <w:link w:val="SubtitleChar"/>
     <w:uiPriority w:val="11"/>
     <w:qFormat/>
-    <w:rsid w:val="000C4162"/>
+    <w:rsid w:val="009D7A2D"/>
     <w:pPr>
       <w:numPr>
         <w:ilvl w:val="1"/>
@@ -891,7 +891,7 @@
     <w:basedOn w:val="DefaultParagraphFont"/>
     <w:link w:val="Subtitle"/>
     <w:uiPriority w:val="11"/>
-    <w:rsid w:val="000C4162"/>
+    <w:rsid w:val="009D7A2D"/>
     <w:rPr>
       <w:rFonts w:eastAsiaTheme="majorEastAsia" w:cstheme="majorBidi"/>
       <w:color w:val="595959" w:themeColor="text1" w:themeTint="A6"/>
@@ -907,7 +907,7 @@
     <w:link w:val="QuoteChar"/>
     <w:uiPriority w:val="29"/>
     <w:qFormat/>
-    <w:rsid w:val="000C4162"/>
+    <w:rsid w:val="009D7A2D"/>
     <w:pPr>
       <w:spacing w:before="160"/>
       <w:jc w:val="center"/>
@@ -923,7 +923,7 @@
     <w:basedOn w:val="DefaultParagraphFont"/>
     <w:link w:val="Quote"/>
     <w:uiPriority w:val="29"/>
-    <w:rsid w:val="000C4162"/>
+    <w:rsid w:val="009D7A2D"/>
     <w:rPr>
       <w:i/>
       <w:iCs/>
@@ -935,7 +935,7 @@
     <w:basedOn w:val="Normal"/>
     <w:uiPriority w:val="34"/>
     <w:qFormat/>
-    <w:rsid w:val="000C4162"/>
+    <w:rsid w:val="009D7A2D"/>
     <w:pPr>
       <w:ind w:left="720"/>
       <w:contextualSpacing/>
@@ -946,7 +946,7 @@
     <w:basedOn w:val="DefaultParagraphFont"/>
     <w:uiPriority w:val="21"/>
     <w:qFormat/>
-    <w:rsid w:val="000C4162"/>
+    <w:rsid w:val="009D7A2D"/>
     <w:rPr>
       <w:i/>
       <w:iCs/>
@@ -960,7 +960,7 @@
     <w:link w:val="IntenseQuoteChar"/>
     <w:uiPriority w:val="30"/>
     <w:qFormat/>
-    <w:rsid w:val="000C4162"/>
+    <w:rsid w:val="009D7A2D"/>
     <w:pPr>
       <w:pBdr>
         <w:top w:val="single" w:sz="4" w:space="10" w:color="0F4761" w:themeColor="accent1" w:themeShade="BF"/>
@@ -981,7 +981,7 @@
     <w:basedOn w:val="DefaultParagraphFont"/>
     <w:link w:val="IntenseQuote"/>
     <w:uiPriority w:val="30"/>
-    <w:rsid w:val="000C4162"/>
+    <w:rsid w:val="009D7A2D"/>
     <w:rPr>
       <w:i/>
       <w:iCs/>
@@ -993,7 +993,7 @@
     <w:basedOn w:val="DefaultParagraphFont"/>
     <w:uiPriority w:val="32"/>
     <w:qFormat/>
-    <w:rsid w:val="000C4162"/>
+    <w:rsid w:val="009D7A2D"/>
     <w:rPr>
       <w:b/>
       <w:bCs/>

</xml_diff>

<commit_message>
feat(r13): connector label placement and shapes pinned to connectors, with Visio export and import (#8)
Co-Authored-By: Claude Sonnet 5.5 <noreply@anthropic.com>
</commit_message>
<xml_diff>
--- a/docs/acceptance/evidence/DEMO/demo.docx
+++ b/docs/acceptance/evidence/DEMO/demo.docx
@@ -4,7 +4,7 @@
   <w:body>
     <w:p>
       <w:r>
-        <w:object w:dxaOrig="14416" w:dyaOrig="8161" w14:anchorId="3AB73EE2">
+        <w:object w:dxaOrig="14416" w:dyaOrig="8161" w14:anchorId="1BC17FCB">
           <v:shapetype id="_x0000_t75" coordsize="21600,21600" o:spt="75" o:preferrelative="t" path="m@4@5l@4@11@9@11@9@5xe" filled="f" stroked="f">
             <v:stroke joinstyle="miter"/>
             <v:formulas>
@@ -27,7 +27,7 @@
           <v:shape id="_x0000_i1028" type="#_x0000_t75" style="width:720.95pt;height:408.15pt" o:ole="">
             <v:imagedata r:id="rId4" o:title=""/>
           </v:shape>
-          <o:OLEObject Type="Embed" ProgID="Visio.Drawing.15" ShapeID="_x0000_i1028" DrawAspect="Content" ObjectID="_1853870448" r:id="rId5"/>
+          <o:OLEObject Type="Embed" ProgID="Visio.Drawing.15" ShapeID="_x0000_i1028" DrawAspect="Content" ObjectID="_1853880649" r:id="rId5"/>
         </w:object>
       </w:r>
     </w:p>
@@ -449,7 +449,7 @@
     <w:link w:val="Heading1Char"/>
     <w:uiPriority w:val="9"/>
     <w:qFormat/>
-    <w:rsid w:val="009D7A2D"/>
+    <w:rsid w:val="00CD2763"/>
     <w:pPr>
       <w:keepNext/>
       <w:keepLines/>
@@ -472,7 +472,7 @@
     <w:semiHidden/>
     <w:unhideWhenUsed/>
     <w:qFormat/>
-    <w:rsid w:val="009D7A2D"/>
+    <w:rsid w:val="00CD2763"/>
     <w:pPr>
       <w:keepNext/>
       <w:keepLines/>
@@ -495,7 +495,7 @@
     <w:semiHidden/>
     <w:unhideWhenUsed/>
     <w:qFormat/>
-    <w:rsid w:val="009D7A2D"/>
+    <w:rsid w:val="00CD2763"/>
     <w:pPr>
       <w:keepNext/>
       <w:keepLines/>
@@ -518,7 +518,7 @@
     <w:semiHidden/>
     <w:unhideWhenUsed/>
     <w:qFormat/>
-    <w:rsid w:val="009D7A2D"/>
+    <w:rsid w:val="00CD2763"/>
     <w:pPr>
       <w:keepNext/>
       <w:keepLines/>
@@ -541,7 +541,7 @@
     <w:semiHidden/>
     <w:unhideWhenUsed/>
     <w:qFormat/>
-    <w:rsid w:val="009D7A2D"/>
+    <w:rsid w:val="00CD2763"/>
     <w:pPr>
       <w:keepNext/>
       <w:keepLines/>
@@ -562,7 +562,7 @@
     <w:semiHidden/>
     <w:unhideWhenUsed/>
     <w:qFormat/>
-    <w:rsid w:val="009D7A2D"/>
+    <w:rsid w:val="00CD2763"/>
     <w:pPr>
       <w:keepNext/>
       <w:keepLines/>
@@ -585,7 +585,7 @@
     <w:semiHidden/>
     <w:unhideWhenUsed/>
     <w:qFormat/>
-    <w:rsid w:val="009D7A2D"/>
+    <w:rsid w:val="00CD2763"/>
     <w:pPr>
       <w:keepNext/>
       <w:keepLines/>
@@ -606,7 +606,7 @@
     <w:semiHidden/>
     <w:unhideWhenUsed/>
     <w:qFormat/>
-    <w:rsid w:val="009D7A2D"/>
+    <w:rsid w:val="00CD2763"/>
     <w:pPr>
       <w:keepNext/>
       <w:keepLines/>
@@ -629,7 +629,7 @@
     <w:semiHidden/>
     <w:unhideWhenUsed/>
     <w:qFormat/>
-    <w:rsid w:val="009D7A2D"/>
+    <w:rsid w:val="00CD2763"/>
     <w:pPr>
       <w:keepNext/>
       <w:keepLines/>
@@ -717,7 +717,7 @@
     <w:basedOn w:val="DefaultParagraphFont"/>
     <w:link w:val="Heading1"/>
     <w:uiPriority w:val="9"/>
-    <w:rsid w:val="009D7A2D"/>
+    <w:rsid w:val="00CD2763"/>
     <w:rPr>
       <w:rFonts w:asciiTheme="majorHAnsi" w:eastAsiaTheme="majorEastAsia" w:hAnsiTheme="majorHAnsi" w:cstheme="majorBidi"/>
       <w:color w:val="0F4761" w:themeColor="accent1" w:themeShade="BF"/>
@@ -731,7 +731,7 @@
     <w:link w:val="Heading2"/>
     <w:uiPriority w:val="9"/>
     <w:semiHidden/>
-    <w:rsid w:val="009D7A2D"/>
+    <w:rsid w:val="00CD2763"/>
     <w:rPr>
       <w:rFonts w:asciiTheme="majorHAnsi" w:eastAsiaTheme="majorEastAsia" w:hAnsiTheme="majorHAnsi" w:cstheme="majorBidi"/>
       <w:color w:val="0F4761" w:themeColor="accent1" w:themeShade="BF"/>
@@ -745,7 +745,7 @@
     <w:link w:val="Heading3"/>
     <w:uiPriority w:val="9"/>
     <w:semiHidden/>
-    <w:rsid w:val="009D7A2D"/>
+    <w:rsid w:val="00CD2763"/>
     <w:rPr>
       <w:rFonts w:eastAsiaTheme="majorEastAsia" w:cstheme="majorBidi"/>
       <w:color w:val="0F4761" w:themeColor="accent1" w:themeShade="BF"/>
@@ -759,7 +759,7 @@
     <w:link w:val="Heading4"/>
     <w:uiPriority w:val="9"/>
     <w:semiHidden/>
-    <w:rsid w:val="009D7A2D"/>
+    <w:rsid w:val="00CD2763"/>
     <w:rPr>
       <w:rFonts w:eastAsiaTheme="majorEastAsia" w:cstheme="majorBidi"/>
       <w:i/>
@@ -773,7 +773,7 @@
     <w:link w:val="Heading5"/>
     <w:uiPriority w:val="9"/>
     <w:semiHidden/>
-    <w:rsid w:val="009D7A2D"/>
+    <w:rsid w:val="00CD2763"/>
     <w:rPr>
       <w:rFonts w:eastAsiaTheme="majorEastAsia" w:cstheme="majorBidi"/>
       <w:color w:val="0F4761" w:themeColor="accent1" w:themeShade="BF"/>
@@ -785,7 +785,7 @@
     <w:link w:val="Heading6"/>
     <w:uiPriority w:val="9"/>
     <w:semiHidden/>
-    <w:rsid w:val="009D7A2D"/>
+    <w:rsid w:val="00CD2763"/>
     <w:rPr>
       <w:rFonts w:eastAsiaTheme="majorEastAsia" w:cstheme="majorBidi"/>
       <w:i/>
@@ -799,7 +799,7 @@
     <w:link w:val="Heading7"/>
     <w:uiPriority w:val="9"/>
     <w:semiHidden/>
-    <w:rsid w:val="009D7A2D"/>
+    <w:rsid w:val="00CD2763"/>
     <w:rPr>
       <w:rFonts w:eastAsiaTheme="majorEastAsia" w:cstheme="majorBidi"/>
       <w:color w:val="595959" w:themeColor="text1" w:themeTint="A6"/>
@@ -811,7 +811,7 @@
     <w:link w:val="Heading8"/>
     <w:uiPriority w:val="9"/>
     <w:semiHidden/>
-    <w:rsid w:val="009D7A2D"/>
+    <w:rsid w:val="00CD2763"/>
     <w:rPr>
       <w:rFonts w:eastAsiaTheme="majorEastAsia" w:cstheme="majorBidi"/>
       <w:i/>
@@ -825,7 +825,7 @@
     <w:link w:val="Heading9"/>
     <w:uiPriority w:val="9"/>
     <w:semiHidden/>
-    <w:rsid w:val="009D7A2D"/>
+    <w:rsid w:val="00CD2763"/>
     <w:rPr>
       <w:rFonts w:eastAsiaTheme="majorEastAsia" w:cstheme="majorBidi"/>
       <w:color w:val="272727" w:themeColor="text1" w:themeTint="D8"/>
@@ -838,7 +838,7 @@
     <w:link w:val="TitleChar"/>
     <w:uiPriority w:val="10"/>
     <w:qFormat/>
-    <w:rsid w:val="009D7A2D"/>
+    <w:rsid w:val="00CD2763"/>
     <w:pPr>
       <w:spacing w:after="80" w:line="240" w:lineRule="auto"/>
       <w:contextualSpacing/>
@@ -856,7 +856,7 @@
     <w:basedOn w:val="DefaultParagraphFont"/>
     <w:link w:val="Title"/>
     <w:uiPriority w:val="10"/>
-    <w:rsid w:val="009D7A2D"/>
+    <w:rsid w:val="00CD2763"/>
     <w:rPr>
       <w:rFonts w:asciiTheme="majorHAnsi" w:eastAsiaTheme="majorEastAsia" w:hAnsiTheme="majorHAnsi" w:cstheme="majorBidi"/>
       <w:spacing w:val="-10"/>
@@ -872,7 +872,7 @@
     <w:link w:val="SubtitleChar"/>
     <w:uiPriority w:val="11"/>
     <w:qFormat/>
-    <w:rsid w:val="009D7A2D"/>
+    <w:rsid w:val="00CD2763"/>
     <w:pPr>
       <w:numPr>
         <w:ilvl w:val="1"/>
@@ -891,7 +891,7 @@
     <w:basedOn w:val="DefaultParagraphFont"/>
     <w:link w:val="Subtitle"/>
     <w:uiPriority w:val="11"/>
-    <w:rsid w:val="009D7A2D"/>
+    <w:rsid w:val="00CD2763"/>
     <w:rPr>
       <w:rFonts w:eastAsiaTheme="majorEastAsia" w:cstheme="majorBidi"/>
       <w:color w:val="595959" w:themeColor="text1" w:themeTint="A6"/>
@@ -907,7 +907,7 @@
     <w:link w:val="QuoteChar"/>
     <w:uiPriority w:val="29"/>
     <w:qFormat/>
-    <w:rsid w:val="009D7A2D"/>
+    <w:rsid w:val="00CD2763"/>
     <w:pPr>
       <w:spacing w:before="160"/>
       <w:jc w:val="center"/>
@@ -923,7 +923,7 @@
     <w:basedOn w:val="DefaultParagraphFont"/>
     <w:link w:val="Quote"/>
     <w:uiPriority w:val="29"/>
-    <w:rsid w:val="009D7A2D"/>
+    <w:rsid w:val="00CD2763"/>
     <w:rPr>
       <w:i/>
       <w:iCs/>
@@ -935,7 +935,7 @@
     <w:basedOn w:val="Normal"/>
     <w:uiPriority w:val="34"/>
     <w:qFormat/>
-    <w:rsid w:val="009D7A2D"/>
+    <w:rsid w:val="00CD2763"/>
     <w:pPr>
       <w:ind w:left="720"/>
       <w:contextualSpacing/>
@@ -946,7 +946,7 @@
     <w:basedOn w:val="DefaultParagraphFont"/>
     <w:uiPriority w:val="21"/>
     <w:qFormat/>
-    <w:rsid w:val="009D7A2D"/>
+    <w:rsid w:val="00CD2763"/>
     <w:rPr>
       <w:i/>
       <w:iCs/>
@@ -960,7 +960,7 @@
     <w:link w:val="IntenseQuoteChar"/>
     <w:uiPriority w:val="30"/>
     <w:qFormat/>
-    <w:rsid w:val="009D7A2D"/>
+    <w:rsid w:val="00CD2763"/>
     <w:pPr>
       <w:pBdr>
         <w:top w:val="single" w:sz="4" w:space="10" w:color="0F4761" w:themeColor="accent1" w:themeShade="BF"/>
@@ -981,7 +981,7 @@
     <w:basedOn w:val="DefaultParagraphFont"/>
     <w:link w:val="IntenseQuote"/>
     <w:uiPriority w:val="30"/>
-    <w:rsid w:val="009D7A2D"/>
+    <w:rsid w:val="00CD2763"/>
     <w:rPr>
       <w:i/>
       <w:iCs/>
@@ -993,7 +993,7 @@
     <w:basedOn w:val="DefaultParagraphFont"/>
     <w:uiPriority w:val="32"/>
     <w:qFormat/>
-    <w:rsid w:val="009D7A2D"/>
+    <w:rsid w:val="00CD2763"/>
     <w:rPr>
       <w:b/>
       <w:bCs/>

</xml_diff>

<commit_message>
feat(r14): per-side text margins, vertical text and vertical swim-lane titles, with Visio export and import (#9)
Co-Authored-By: Claude Sonnet 5.5 <noreply@anthropic.com>
</commit_message>
<xml_diff>
--- a/docs/acceptance/evidence/DEMO/demo.docx
+++ b/docs/acceptance/evidence/DEMO/demo.docx
@@ -4,7 +4,7 @@
   <w:body>
     <w:p>
       <w:r>
-        <w:object w:dxaOrig="14416" w:dyaOrig="8161" w14:anchorId="1BC17FCB">
+        <w:object w:dxaOrig="14416" w:dyaOrig="8161" w14:anchorId="254C03A7">
           <v:shapetype id="_x0000_t75" coordsize="21600,21600" o:spt="75" o:preferrelative="t" path="m@4@5l@4@11@9@11@9@5xe" filled="f" stroked="f">
             <v:stroke joinstyle="miter"/>
             <v:formulas>
@@ -27,7 +27,7 @@
           <v:shape id="_x0000_i1028" type="#_x0000_t75" style="width:720.95pt;height:408.15pt" o:ole="">
             <v:imagedata r:id="rId4" o:title=""/>
           </v:shape>
-          <o:OLEObject Type="Embed" ProgID="Visio.Drawing.15" ShapeID="_x0000_i1028" DrawAspect="Content" ObjectID="_1853880649" r:id="rId5"/>
+          <o:OLEObject Type="Embed" ProgID="Visio.Drawing.15" ShapeID="_x0000_i1028" DrawAspect="Content" ObjectID="_1853905343" r:id="rId5"/>
         </w:object>
       </w:r>
     </w:p>
@@ -449,7 +449,7 @@
     <w:link w:val="Heading1Char"/>
     <w:uiPriority w:val="9"/>
     <w:qFormat/>
-    <w:rsid w:val="00CD2763"/>
+    <w:rsid w:val="00E51F15"/>
     <w:pPr>
       <w:keepNext/>
       <w:keepLines/>
@@ -472,7 +472,7 @@
     <w:semiHidden/>
     <w:unhideWhenUsed/>
     <w:qFormat/>
-    <w:rsid w:val="00CD2763"/>
+    <w:rsid w:val="00E51F15"/>
     <w:pPr>
       <w:keepNext/>
       <w:keepLines/>
@@ -495,7 +495,7 @@
     <w:semiHidden/>
     <w:unhideWhenUsed/>
     <w:qFormat/>
-    <w:rsid w:val="00CD2763"/>
+    <w:rsid w:val="00E51F15"/>
     <w:pPr>
       <w:keepNext/>
       <w:keepLines/>
@@ -518,7 +518,7 @@
     <w:semiHidden/>
     <w:unhideWhenUsed/>
     <w:qFormat/>
-    <w:rsid w:val="00CD2763"/>
+    <w:rsid w:val="00E51F15"/>
     <w:pPr>
       <w:keepNext/>
       <w:keepLines/>
@@ -541,7 +541,7 @@
     <w:semiHidden/>
     <w:unhideWhenUsed/>
     <w:qFormat/>
-    <w:rsid w:val="00CD2763"/>
+    <w:rsid w:val="00E51F15"/>
     <w:pPr>
       <w:keepNext/>
       <w:keepLines/>
@@ -562,7 +562,7 @@
     <w:semiHidden/>
     <w:unhideWhenUsed/>
     <w:qFormat/>
-    <w:rsid w:val="00CD2763"/>
+    <w:rsid w:val="00E51F15"/>
     <w:pPr>
       <w:keepNext/>
       <w:keepLines/>
@@ -585,7 +585,7 @@
     <w:semiHidden/>
     <w:unhideWhenUsed/>
     <w:qFormat/>
-    <w:rsid w:val="00CD2763"/>
+    <w:rsid w:val="00E51F15"/>
     <w:pPr>
       <w:keepNext/>
       <w:keepLines/>
@@ -606,7 +606,7 @@
     <w:semiHidden/>
     <w:unhideWhenUsed/>
     <w:qFormat/>
-    <w:rsid w:val="00CD2763"/>
+    <w:rsid w:val="00E51F15"/>
     <w:pPr>
       <w:keepNext/>
       <w:keepLines/>
@@ -629,7 +629,7 @@
     <w:semiHidden/>
     <w:unhideWhenUsed/>
     <w:qFormat/>
-    <w:rsid w:val="00CD2763"/>
+    <w:rsid w:val="00E51F15"/>
     <w:pPr>
       <w:keepNext/>
       <w:keepLines/>
@@ -717,7 +717,7 @@
     <w:basedOn w:val="DefaultParagraphFont"/>
     <w:link w:val="Heading1"/>
     <w:uiPriority w:val="9"/>
-    <w:rsid w:val="00CD2763"/>
+    <w:rsid w:val="00E51F15"/>
     <w:rPr>
       <w:rFonts w:asciiTheme="majorHAnsi" w:eastAsiaTheme="majorEastAsia" w:hAnsiTheme="majorHAnsi" w:cstheme="majorBidi"/>
       <w:color w:val="0F4761" w:themeColor="accent1" w:themeShade="BF"/>
@@ -731,7 +731,7 @@
     <w:link w:val="Heading2"/>
     <w:uiPriority w:val="9"/>
     <w:semiHidden/>
-    <w:rsid w:val="00CD2763"/>
+    <w:rsid w:val="00E51F15"/>
     <w:rPr>
       <w:rFonts w:asciiTheme="majorHAnsi" w:eastAsiaTheme="majorEastAsia" w:hAnsiTheme="majorHAnsi" w:cstheme="majorBidi"/>
       <w:color w:val="0F4761" w:themeColor="accent1" w:themeShade="BF"/>
@@ -745,7 +745,7 @@
     <w:link w:val="Heading3"/>
     <w:uiPriority w:val="9"/>
     <w:semiHidden/>
-    <w:rsid w:val="00CD2763"/>
+    <w:rsid w:val="00E51F15"/>
     <w:rPr>
       <w:rFonts w:eastAsiaTheme="majorEastAsia" w:cstheme="majorBidi"/>
       <w:color w:val="0F4761" w:themeColor="accent1" w:themeShade="BF"/>
@@ -759,7 +759,7 @@
     <w:link w:val="Heading4"/>
     <w:uiPriority w:val="9"/>
     <w:semiHidden/>
-    <w:rsid w:val="00CD2763"/>
+    <w:rsid w:val="00E51F15"/>
     <w:rPr>
       <w:rFonts w:eastAsiaTheme="majorEastAsia" w:cstheme="majorBidi"/>
       <w:i/>
@@ -773,7 +773,7 @@
     <w:link w:val="Heading5"/>
     <w:uiPriority w:val="9"/>
     <w:semiHidden/>
-    <w:rsid w:val="00CD2763"/>
+    <w:rsid w:val="00E51F15"/>
     <w:rPr>
       <w:rFonts w:eastAsiaTheme="majorEastAsia" w:cstheme="majorBidi"/>
       <w:color w:val="0F4761" w:themeColor="accent1" w:themeShade="BF"/>
@@ -785,7 +785,7 @@
     <w:link w:val="Heading6"/>
     <w:uiPriority w:val="9"/>
     <w:semiHidden/>
-    <w:rsid w:val="00CD2763"/>
+    <w:rsid w:val="00E51F15"/>
     <w:rPr>
       <w:rFonts w:eastAsiaTheme="majorEastAsia" w:cstheme="majorBidi"/>
       <w:i/>
@@ -799,7 +799,7 @@
     <w:link w:val="Heading7"/>
     <w:uiPriority w:val="9"/>
     <w:semiHidden/>
-    <w:rsid w:val="00CD2763"/>
+    <w:rsid w:val="00E51F15"/>
     <w:rPr>
       <w:rFonts w:eastAsiaTheme="majorEastAsia" w:cstheme="majorBidi"/>
       <w:color w:val="595959" w:themeColor="text1" w:themeTint="A6"/>
@@ -811,7 +811,7 @@
     <w:link w:val="Heading8"/>
     <w:uiPriority w:val="9"/>
     <w:semiHidden/>
-    <w:rsid w:val="00CD2763"/>
+    <w:rsid w:val="00E51F15"/>
     <w:rPr>
       <w:rFonts w:eastAsiaTheme="majorEastAsia" w:cstheme="majorBidi"/>
       <w:i/>
@@ -825,7 +825,7 @@
     <w:link w:val="Heading9"/>
     <w:uiPriority w:val="9"/>
     <w:semiHidden/>
-    <w:rsid w:val="00CD2763"/>
+    <w:rsid w:val="00E51F15"/>
     <w:rPr>
       <w:rFonts w:eastAsiaTheme="majorEastAsia" w:cstheme="majorBidi"/>
       <w:color w:val="272727" w:themeColor="text1" w:themeTint="D8"/>
@@ -838,7 +838,7 @@
     <w:link w:val="TitleChar"/>
     <w:uiPriority w:val="10"/>
     <w:qFormat/>
-    <w:rsid w:val="00CD2763"/>
+    <w:rsid w:val="00E51F15"/>
     <w:pPr>
       <w:spacing w:after="80" w:line="240" w:lineRule="auto"/>
       <w:contextualSpacing/>
@@ -856,7 +856,7 @@
     <w:basedOn w:val="DefaultParagraphFont"/>
     <w:link w:val="Title"/>
     <w:uiPriority w:val="10"/>
-    <w:rsid w:val="00CD2763"/>
+    <w:rsid w:val="00E51F15"/>
     <w:rPr>
       <w:rFonts w:asciiTheme="majorHAnsi" w:eastAsiaTheme="majorEastAsia" w:hAnsiTheme="majorHAnsi" w:cstheme="majorBidi"/>
       <w:spacing w:val="-10"/>
@@ -872,7 +872,7 @@
     <w:link w:val="SubtitleChar"/>
     <w:uiPriority w:val="11"/>
     <w:qFormat/>
-    <w:rsid w:val="00CD2763"/>
+    <w:rsid w:val="00E51F15"/>
     <w:pPr>
       <w:numPr>
         <w:ilvl w:val="1"/>
@@ -891,7 +891,7 @@
     <w:basedOn w:val="DefaultParagraphFont"/>
     <w:link w:val="Subtitle"/>
     <w:uiPriority w:val="11"/>
-    <w:rsid w:val="00CD2763"/>
+    <w:rsid w:val="00E51F15"/>
     <w:rPr>
       <w:rFonts w:eastAsiaTheme="majorEastAsia" w:cstheme="majorBidi"/>
       <w:color w:val="595959" w:themeColor="text1" w:themeTint="A6"/>
@@ -907,7 +907,7 @@
     <w:link w:val="QuoteChar"/>
     <w:uiPriority w:val="29"/>
     <w:qFormat/>
-    <w:rsid w:val="00CD2763"/>
+    <w:rsid w:val="00E51F15"/>
     <w:pPr>
       <w:spacing w:before="160"/>
       <w:jc w:val="center"/>
@@ -923,7 +923,7 @@
     <w:basedOn w:val="DefaultParagraphFont"/>
     <w:link w:val="Quote"/>
     <w:uiPriority w:val="29"/>
-    <w:rsid w:val="00CD2763"/>
+    <w:rsid w:val="00E51F15"/>
     <w:rPr>
       <w:i/>
       <w:iCs/>
@@ -935,7 +935,7 @@
     <w:basedOn w:val="Normal"/>
     <w:uiPriority w:val="34"/>
     <w:qFormat/>
-    <w:rsid w:val="00CD2763"/>
+    <w:rsid w:val="00E51F15"/>
     <w:pPr>
       <w:ind w:left="720"/>
       <w:contextualSpacing/>
@@ -946,7 +946,7 @@
     <w:basedOn w:val="DefaultParagraphFont"/>
     <w:uiPriority w:val="21"/>
     <w:qFormat/>
-    <w:rsid w:val="00CD2763"/>
+    <w:rsid w:val="00E51F15"/>
     <w:rPr>
       <w:i/>
       <w:iCs/>
@@ -960,7 +960,7 @@
     <w:link w:val="IntenseQuoteChar"/>
     <w:uiPriority w:val="30"/>
     <w:qFormat/>
-    <w:rsid w:val="00CD2763"/>
+    <w:rsid w:val="00E51F15"/>
     <w:pPr>
       <w:pBdr>
         <w:top w:val="single" w:sz="4" w:space="10" w:color="0F4761" w:themeColor="accent1" w:themeShade="BF"/>
@@ -981,7 +981,7 @@
     <w:basedOn w:val="DefaultParagraphFont"/>
     <w:link w:val="IntenseQuote"/>
     <w:uiPriority w:val="30"/>
-    <w:rsid w:val="00CD2763"/>
+    <w:rsid w:val="00E51F15"/>
     <w:rPr>
       <w:i/>
       <w:iCs/>
@@ -993,7 +993,7 @@
     <w:basedOn w:val="DefaultParagraphFont"/>
     <w:uiPriority w:val="32"/>
     <w:qFormat/>
-    <w:rsid w:val="00CD2763"/>
+    <w:rsid w:val="00E51F15"/>
     <w:rPr>
       <w:b/>
       <w:bCs/>

</xml_diff>